<commit_message>
Meter pic not uploading
</commit_message>
<xml_diff>
--- a/DATABASE.docx
+++ b/DATABASE.docx
@@ -19,28 +19,12 @@
     </w:p>
     <w:p>
       <w:r>
-        <w:t xml:space="preserve">CREATE DATABASE IF NOT EXISTS </w:t>
-      </w:r>
-      <w:proofErr w:type="spellStart"/>
-      <w:r>
-        <w:t>rental_management</w:t>
-      </w:r>
-      <w:proofErr w:type="spellEnd"/>
-      <w:r>
-        <w:t>;</w:t>
-      </w:r>
-    </w:p>
-    <w:p>
-      <w:r>
-        <w:t xml:space="preserve">USE </w:t>
-      </w:r>
-      <w:proofErr w:type="spellStart"/>
-      <w:r>
-        <w:t>rental_management</w:t>
-      </w:r>
-      <w:proofErr w:type="spellEnd"/>
-      <w:r>
-        <w:t>;</w:t>
+        <w:t>CREATE DATABASE IF NOT EXISTS rental_management;</w:t>
+      </w:r>
+    </w:p>
+    <w:p>
+      <w:r>
+        <w:t>USE rental_management;</w:t>
       </w:r>
     </w:p>
     <w:p/>
@@ -80,15 +64,7 @@
     </w:p>
     <w:p>
       <w:r>
-        <w:t xml:space="preserve">    name </w:t>
-      </w:r>
-      <w:proofErr w:type="gramStart"/>
-      <w:r>
-        <w:t>VARCHAR(</w:t>
-      </w:r>
-      <w:proofErr w:type="gramEnd"/>
-      <w:r>
-        <w:t>150) NOT NULL,</w:t>
+        <w:t xml:space="preserve">    name VARCHAR(150) NOT NULL,</w:t>
       </w:r>
     </w:p>
     <w:p>
@@ -98,41 +74,17 @@
     </w:p>
     <w:p>
       <w:r>
-        <w:t xml:space="preserve">    status </w:t>
-      </w:r>
-      <w:proofErr w:type="gramStart"/>
-      <w:r>
-        <w:t>TINYINT(</w:t>
-      </w:r>
-      <w:proofErr w:type="gramEnd"/>
-      <w:r>
-        <w:t>1) DEFAULT 1,</w:t>
-      </w:r>
-    </w:p>
-    <w:p>
-      <w:r>
-        <w:t xml:space="preserve">    </w:t>
-      </w:r>
-      <w:proofErr w:type="spellStart"/>
-      <w:r>
-        <w:t>created_at</w:t>
-      </w:r>
-      <w:proofErr w:type="spellEnd"/>
-      <w:r>
-        <w:t xml:space="preserve"> DATETIME DEFAULT CURRENT_TIMESTAMP</w:t>
-      </w:r>
-    </w:p>
-    <w:p>
-      <w:r>
-        <w:t>) ENGINE=</w:t>
-      </w:r>
-      <w:proofErr w:type="spellStart"/>
-      <w:r>
-        <w:t>InnoDB</w:t>
-      </w:r>
-      <w:proofErr w:type="spellEnd"/>
-      <w:r>
-        <w:t>;</w:t>
+        <w:t xml:space="preserve">    status TINYINT(1) DEFAULT 1,</w:t>
+      </w:r>
+    </w:p>
+    <w:p>
+      <w:r>
+        <w:t xml:space="preserve">    created_at DATETIME DEFAULT CURRENT_TIMESTAMP</w:t>
+      </w:r>
+    </w:p>
+    <w:p>
+      <w:r>
+        <w:t>) ENGINE=InnoDB;</w:t>
       </w:r>
     </w:p>
     <w:p/>
@@ -172,90 +124,37 @@
     </w:p>
     <w:p>
       <w:r>
+        <w:t xml:space="preserve">    building_id INT NOT NULL,</w:t>
+      </w:r>
+    </w:p>
+    <w:p>
+      <w:r>
+        <w:t xml:space="preserve">    unit_name VARCHAR(150) NOT NULL,</w:t>
+      </w:r>
+    </w:p>
+    <w:p>
+      <w:r>
+        <w:t xml:space="preserve">    status TINYINT(1) DEFAULT 1,</w:t>
+      </w:r>
+    </w:p>
+    <w:p>
+      <w:r>
+        <w:t xml:space="preserve">    created_at DATETIME DEFAULT CURRENT_TIMESTAMP,</w:t>
+      </w:r>
+    </w:p>
+    <w:p>
+      <w:r>
         <w:t xml:space="preserve">    </w:t>
       </w:r>
-      <w:proofErr w:type="spellStart"/>
-      <w:r>
-        <w:t>building_id</w:t>
-      </w:r>
-      <w:proofErr w:type="spellEnd"/>
-      <w:r>
-        <w:t xml:space="preserve"> INT NOT NULL,</w:t>
-      </w:r>
-    </w:p>
-    <w:p>
-      <w:r>
-        <w:t xml:space="preserve">    </w:t>
-      </w:r>
-      <w:proofErr w:type="spellStart"/>
-      <w:r>
-        <w:t>unit_name</w:t>
-      </w:r>
-      <w:proofErr w:type="spellEnd"/>
-      <w:r>
-        <w:t xml:space="preserve"> </w:t>
-      </w:r>
-      <w:proofErr w:type="gramStart"/>
-      <w:r>
-        <w:t>VARCHAR(</w:t>
-      </w:r>
-      <w:proofErr w:type="gramEnd"/>
-      <w:r>
-        <w:t>150) NOT NULL,</w:t>
-      </w:r>
-    </w:p>
-    <w:p>
-      <w:r>
-        <w:t xml:space="preserve">    status </w:t>
-      </w:r>
-      <w:proofErr w:type="gramStart"/>
-      <w:r>
-        <w:t>TINYINT(</w:t>
-      </w:r>
-      <w:proofErr w:type="gramEnd"/>
-      <w:r>
-        <w:t>1) DEFAULT 1,</w:t>
-      </w:r>
-    </w:p>
-    <w:p>
-      <w:r>
-        <w:t xml:space="preserve">    </w:t>
-      </w:r>
-      <w:proofErr w:type="spellStart"/>
-      <w:r>
-        <w:t>created_at</w:t>
-      </w:r>
-      <w:proofErr w:type="spellEnd"/>
-      <w:r>
-        <w:t xml:space="preserve"> DATETIME DEFAULT CURRENT_TIMESTAMP,</w:t>
-      </w:r>
-    </w:p>
-    <w:p>
-      <w:r>
-        <w:t xml:space="preserve">    </w:t>
-      </w:r>
-    </w:p>
-    <w:p>
-      <w:r>
-        <w:t xml:space="preserve">    CONSTRAINT </w:t>
-      </w:r>
-      <w:proofErr w:type="spellStart"/>
-      <w:r>
-        <w:t>fk_units_building</w:t>
-      </w:r>
-      <w:proofErr w:type="spellEnd"/>
-    </w:p>
-    <w:p>
-      <w:r>
-        <w:t xml:space="preserve">        FOREIGN KEY (</w:t>
-      </w:r>
-      <w:proofErr w:type="spellStart"/>
-      <w:r>
-        <w:t>building_id</w:t>
-      </w:r>
-      <w:proofErr w:type="spellEnd"/>
-      <w:r>
-        <w:t>) REFERENCES buildings(id)</w:t>
+    </w:p>
+    <w:p>
+      <w:r>
+        <w:t xml:space="preserve">    CONSTRAINT fk_units_building</w:t>
+      </w:r>
+    </w:p>
+    <w:p>
+      <w:r>
+        <w:t xml:space="preserve">        FOREIGN KEY (building_id) REFERENCES buildings(id)</w:t>
       </w:r>
     </w:p>
     <w:p>
@@ -265,15 +164,7 @@
     </w:p>
     <w:p>
       <w:r>
-        <w:t>) ENGINE=</w:t>
-      </w:r>
-      <w:proofErr w:type="spellStart"/>
-      <w:r>
-        <w:t>InnoDB</w:t>
-      </w:r>
-      <w:proofErr w:type="spellEnd"/>
-      <w:r>
-        <w:t>;</w:t>
+        <w:t>) ENGINE=InnoDB;</w:t>
       </w:r>
     </w:p>
     <w:p/>
@@ -313,28 +204,15 @@
     </w:p>
     <w:p>
       <w:r>
-        <w:t xml:space="preserve">    name </w:t>
-      </w:r>
-      <w:proofErr w:type="gramStart"/>
-      <w:r>
-        <w:t>VARCHAR(</w:t>
-      </w:r>
-      <w:proofErr w:type="gramEnd"/>
-      <w:r>
-        <w:t>150) NOT NULL,</w:t>
+        <w:t xml:space="preserve">    name VARCHAR(150) NOT NULL,</w:t>
       </w:r>
     </w:p>
     <w:p>
       <w:r>
         <w:t xml:space="preserve">    mobile </w:t>
       </w:r>
-      <w:proofErr w:type="gramStart"/>
-      <w:r>
-        <w:t>CHAR(</w:t>
-      </w:r>
-      <w:proofErr w:type="gramEnd"/>
-      <w:r>
-        <w:t>10)</w:t>
+      <w:r>
+        <w:t>CHAR(10)</w:t>
       </w:r>
       <w:r>
         <w:t xml:space="preserve"> NULL,</w:t>
@@ -342,62 +220,22 @@
     </w:p>
     <w:p>
       <w:r>
-        <w:t xml:space="preserve">    </w:t>
-      </w:r>
-      <w:proofErr w:type="spellStart"/>
-      <w:r>
-        <w:t>id_proof</w:t>
-      </w:r>
-      <w:proofErr w:type="spellEnd"/>
-      <w:r>
-        <w:t xml:space="preserve"> </w:t>
-      </w:r>
-      <w:proofErr w:type="gramStart"/>
-      <w:r>
-        <w:t>VARCHAR(</w:t>
-      </w:r>
-      <w:proofErr w:type="gramEnd"/>
-      <w:r>
-        <w:t>255) NULL,</w:t>
-      </w:r>
-    </w:p>
-    <w:p>
-      <w:r>
-        <w:t xml:space="preserve">    status ENUM('</w:t>
-      </w:r>
-      <w:proofErr w:type="spellStart"/>
-      <w:r>
-        <w:t>active','inactive</w:t>
-      </w:r>
-      <w:proofErr w:type="spellEnd"/>
-      <w:r>
-        <w:t>') DEFAULT 'active',</w:t>
-      </w:r>
-    </w:p>
-    <w:p>
-      <w:r>
-        <w:t xml:space="preserve">    </w:t>
-      </w:r>
-      <w:proofErr w:type="spellStart"/>
-      <w:r>
-        <w:t>created_at</w:t>
-      </w:r>
-      <w:proofErr w:type="spellEnd"/>
-      <w:r>
-        <w:t xml:space="preserve"> DATETIME DEFAULT CURRENT_TIMESTAMP</w:t>
-      </w:r>
-    </w:p>
-    <w:p>
-      <w:r>
-        <w:t>) ENGINE=</w:t>
-      </w:r>
-      <w:proofErr w:type="spellStart"/>
-      <w:r>
-        <w:t>InnoDB</w:t>
-      </w:r>
-      <w:proofErr w:type="spellEnd"/>
-      <w:r>
-        <w:t>;</w:t>
+        <w:t xml:space="preserve">    id_proof VARCHAR(255) NULL,</w:t>
+      </w:r>
+    </w:p>
+    <w:p>
+      <w:r>
+        <w:t xml:space="preserve">    status ENUM('active','inactive') DEFAULT 'active',</w:t>
+      </w:r>
+    </w:p>
+    <w:p>
+      <w:r>
+        <w:t xml:space="preserve">    created_at DATETIME DEFAULT CURRENT_TIMESTAMP</w:t>
+      </w:r>
+    </w:p>
+    <w:p>
+      <w:r>
+        <w:t>) ENGINE=InnoDB;</w:t>
       </w:r>
     </w:p>
     <w:p/>
@@ -428,15 +266,7 @@
     <w:p>
       <w:r>
         <w:lastRenderedPageBreak/>
-        <w:t xml:space="preserve">CREATE TABLE </w:t>
-      </w:r>
-      <w:proofErr w:type="spellStart"/>
-      <w:r>
-        <w:t>tenant_unit_mapping</w:t>
-      </w:r>
-      <w:proofErr w:type="spellEnd"/>
-      <w:r>
-        <w:t xml:space="preserve"> (</w:t>
+        <w:t>CREATE TABLE tenant_unit_mapping (</w:t>
       </w:r>
     </w:p>
     <w:p>
@@ -446,82 +276,37 @@
     </w:p>
     <w:p>
       <w:r>
+        <w:t xml:space="preserve">    tenant_id INT NOT NULL,</w:t>
+      </w:r>
+    </w:p>
+    <w:p>
+      <w:r>
+        <w:t xml:space="preserve">    unit_id INT NOT NULL,</w:t>
+      </w:r>
+    </w:p>
+    <w:p>
+      <w:r>
+        <w:t xml:space="preserve">    effective_from DATE NOT NULL,</w:t>
+      </w:r>
+    </w:p>
+    <w:p>
+      <w:r>
+        <w:t xml:space="preserve">    effective_to DATE NULL,</w:t>
+      </w:r>
+    </w:p>
+    <w:p>
+      <w:r>
         <w:t xml:space="preserve">    </w:t>
       </w:r>
-      <w:proofErr w:type="spellStart"/>
-      <w:r>
-        <w:t>tenant_id</w:t>
-      </w:r>
-      <w:proofErr w:type="spellEnd"/>
-      <w:r>
-        <w:t xml:space="preserve"> INT NOT NULL,</w:t>
-      </w:r>
-    </w:p>
-    <w:p>
-      <w:r>
-        <w:t xml:space="preserve">    </w:t>
-      </w:r>
-      <w:proofErr w:type="spellStart"/>
-      <w:r>
-        <w:t>unit_id</w:t>
-      </w:r>
-      <w:proofErr w:type="spellEnd"/>
-      <w:r>
-        <w:t xml:space="preserve"> INT NOT NULL,</w:t>
-      </w:r>
-    </w:p>
-    <w:p>
-      <w:r>
-        <w:t xml:space="preserve">    </w:t>
-      </w:r>
-      <w:proofErr w:type="spellStart"/>
-      <w:r>
-        <w:t>effective_from</w:t>
-      </w:r>
-      <w:proofErr w:type="spellEnd"/>
-      <w:r>
-        <w:t xml:space="preserve"> DATE NOT NULL,</w:t>
-      </w:r>
-    </w:p>
-    <w:p>
-      <w:r>
-        <w:t xml:space="preserve">    </w:t>
-      </w:r>
-      <w:proofErr w:type="spellStart"/>
-      <w:r>
-        <w:t>effective_to</w:t>
-      </w:r>
-      <w:proofErr w:type="spellEnd"/>
-      <w:r>
-        <w:t xml:space="preserve"> DATE NULL,</w:t>
-      </w:r>
-    </w:p>
-    <w:p>
-      <w:r>
-        <w:t xml:space="preserve">    </w:t>
-      </w:r>
-    </w:p>
-    <w:p>
-      <w:r>
-        <w:t xml:space="preserve">    CONSTRAINT </w:t>
-      </w:r>
-      <w:proofErr w:type="spellStart"/>
-      <w:r>
-        <w:t>fk_tum_tenant</w:t>
-      </w:r>
-      <w:proofErr w:type="spellEnd"/>
-    </w:p>
-    <w:p>
-      <w:r>
-        <w:t xml:space="preserve">        FOREIGN KEY (</w:t>
-      </w:r>
-      <w:proofErr w:type="spellStart"/>
-      <w:r>
-        <w:t>tenant_id</w:t>
-      </w:r>
-      <w:proofErr w:type="spellEnd"/>
-      <w:r>
-        <w:t>) REFERENCES tenants(id)</w:t>
+    </w:p>
+    <w:p>
+      <w:r>
+        <w:t xml:space="preserve">    CONSTRAINT fk_tum_tenant</w:t>
+      </w:r>
+    </w:p>
+    <w:p>
+      <w:r>
+        <w:t xml:space="preserve">        FOREIGN KEY (tenant_id) REFERENCES tenants(id)</w:t>
       </w:r>
     </w:p>
     <w:p>
@@ -536,25 +321,12 @@
     </w:p>
     <w:p>
       <w:r>
-        <w:t xml:space="preserve">    CONSTRAINT </w:t>
-      </w:r>
-      <w:proofErr w:type="spellStart"/>
-      <w:r>
-        <w:t>fk_tum_unit</w:t>
-      </w:r>
-      <w:proofErr w:type="spellEnd"/>
-    </w:p>
-    <w:p>
-      <w:r>
-        <w:t xml:space="preserve">        FOREIGN KEY (</w:t>
-      </w:r>
-      <w:proofErr w:type="spellStart"/>
-      <w:r>
-        <w:t>unit_id</w:t>
-      </w:r>
-      <w:proofErr w:type="spellEnd"/>
-      <w:r>
-        <w:t>) REFERENCES units(id)</w:t>
+        <w:t xml:space="preserve">    CONSTRAINT fk_tum_unit</w:t>
+      </w:r>
+    </w:p>
+    <w:p>
+      <w:r>
+        <w:t xml:space="preserve">        FOREIGN KEY (unit_id) REFERENCES units(id)</w:t>
       </w:r>
     </w:p>
     <w:p>
@@ -569,44 +341,12 @@
     </w:p>
     <w:p>
       <w:r>
-        <w:t xml:space="preserve">    INDEX </w:t>
-      </w:r>
-      <w:proofErr w:type="spellStart"/>
-      <w:r>
-        <w:t>idx_tum_dates</w:t>
-      </w:r>
-      <w:proofErr w:type="spellEnd"/>
-      <w:r>
-        <w:t xml:space="preserve"> (</w:t>
-      </w:r>
-      <w:proofErr w:type="spellStart"/>
-      <w:r>
-        <w:t>effective_from</w:t>
-      </w:r>
-      <w:proofErr w:type="spellEnd"/>
-      <w:r>
-        <w:t xml:space="preserve">, </w:t>
-      </w:r>
-      <w:proofErr w:type="spellStart"/>
-      <w:r>
-        <w:t>effective_to</w:t>
-      </w:r>
-      <w:proofErr w:type="spellEnd"/>
-      <w:r>
-        <w:t>)</w:t>
-      </w:r>
-    </w:p>
-    <w:p>
-      <w:r>
-        <w:t>) ENGINE=</w:t>
-      </w:r>
-      <w:proofErr w:type="spellStart"/>
-      <w:r>
-        <w:t>InnoDB</w:t>
-      </w:r>
-      <w:proofErr w:type="spellEnd"/>
-      <w:r>
-        <w:t>;</w:t>
+        <w:t xml:space="preserve">    INDEX idx_tum_dates (effective_from, effective_to)</w:t>
+      </w:r>
+    </w:p>
+    <w:p>
+      <w:r>
+        <w:t>) ENGINE=InnoDB;</w:t>
       </w:r>
     </w:p>
     <w:p/>
@@ -636,15 +376,7 @@
     </w:p>
     <w:p>
       <w:r>
-        <w:t xml:space="preserve">CREATE TABLE </w:t>
-      </w:r>
-      <w:proofErr w:type="spellStart"/>
-      <w:r>
-        <w:t>rent_history</w:t>
-      </w:r>
-      <w:proofErr w:type="spellEnd"/>
-      <w:r>
-        <w:t xml:space="preserve"> (</w:t>
+        <w:t>CREATE TABLE rent_history (</w:t>
       </w:r>
     </w:p>
     <w:p>
@@ -654,90 +386,37 @@
     </w:p>
     <w:p>
       <w:r>
+        <w:t xml:space="preserve">    unit_id INT NOT NULL,</w:t>
+      </w:r>
+    </w:p>
+    <w:p>
+      <w:r>
+        <w:t xml:space="preserve">    rent_amount DECIMAL(10,2) NOT NULL,</w:t>
+      </w:r>
+    </w:p>
+    <w:p>
+      <w:r>
+        <w:t xml:space="preserve">    effective_from DATE NOT NULL,</w:t>
+      </w:r>
+    </w:p>
+    <w:p>
+      <w:r>
+        <w:t xml:space="preserve">    effective_to DATE NULL,</w:t>
+      </w:r>
+    </w:p>
+    <w:p>
+      <w:r>
         <w:t xml:space="preserve">    </w:t>
       </w:r>
-      <w:proofErr w:type="spellStart"/>
-      <w:r>
-        <w:t>unit_id</w:t>
-      </w:r>
-      <w:proofErr w:type="spellEnd"/>
-      <w:r>
-        <w:t xml:space="preserve"> INT NOT NULL,</w:t>
-      </w:r>
-    </w:p>
-    <w:p>
-      <w:r>
-        <w:t xml:space="preserve">    </w:t>
-      </w:r>
-      <w:proofErr w:type="spellStart"/>
-      <w:r>
-        <w:t>rent_amount</w:t>
-      </w:r>
-      <w:proofErr w:type="spellEnd"/>
-      <w:r>
-        <w:t xml:space="preserve"> </w:t>
-      </w:r>
-      <w:proofErr w:type="gramStart"/>
-      <w:r>
-        <w:t>DECIMAL(</w:t>
-      </w:r>
-      <w:proofErr w:type="gramEnd"/>
-      <w:r>
-        <w:t>10,2) NOT NULL,</w:t>
-      </w:r>
-    </w:p>
-    <w:p>
-      <w:r>
-        <w:t xml:space="preserve">    </w:t>
-      </w:r>
-      <w:proofErr w:type="spellStart"/>
-      <w:r>
-        <w:t>effective_from</w:t>
-      </w:r>
-      <w:proofErr w:type="spellEnd"/>
-      <w:r>
-        <w:t xml:space="preserve"> DATE NOT NULL,</w:t>
-      </w:r>
-    </w:p>
-    <w:p>
-      <w:r>
-        <w:t xml:space="preserve">    </w:t>
-      </w:r>
-      <w:proofErr w:type="spellStart"/>
-      <w:r>
-        <w:t>effective_to</w:t>
-      </w:r>
-      <w:proofErr w:type="spellEnd"/>
-      <w:r>
-        <w:t xml:space="preserve"> DATE NULL,</w:t>
-      </w:r>
-    </w:p>
-    <w:p>
-      <w:r>
-        <w:t xml:space="preserve">    </w:t>
-      </w:r>
-    </w:p>
-    <w:p>
-      <w:r>
-        <w:t xml:space="preserve">    CONSTRAINT </w:t>
-      </w:r>
-      <w:proofErr w:type="spellStart"/>
-      <w:r>
-        <w:t>fk_rent_unit</w:t>
-      </w:r>
-      <w:proofErr w:type="spellEnd"/>
-    </w:p>
-    <w:p>
-      <w:r>
-        <w:t xml:space="preserve">        FOREIGN KEY (</w:t>
-      </w:r>
-      <w:proofErr w:type="spellStart"/>
-      <w:r>
-        <w:t>unit_id</w:t>
-      </w:r>
-      <w:proofErr w:type="spellEnd"/>
-      <w:r>
-        <w:t>) REFERENCES units(id)</w:t>
+    </w:p>
+    <w:p>
+      <w:r>
+        <w:t xml:space="preserve">    CONSTRAINT fk_rent_unit</w:t>
+      </w:r>
+    </w:p>
+    <w:p>
+      <w:r>
+        <w:t xml:space="preserve">        FOREIGN KEY (unit_id) REFERENCES units(id)</w:t>
       </w:r>
     </w:p>
     <w:p>
@@ -752,44 +431,12 @@
     </w:p>
     <w:p>
       <w:r>
-        <w:t xml:space="preserve">    INDEX </w:t>
-      </w:r>
-      <w:proofErr w:type="spellStart"/>
-      <w:r>
-        <w:t>idx_rent_dates</w:t>
-      </w:r>
-      <w:proofErr w:type="spellEnd"/>
-      <w:r>
-        <w:t xml:space="preserve"> (</w:t>
-      </w:r>
-      <w:proofErr w:type="spellStart"/>
-      <w:r>
-        <w:t>effective_from</w:t>
-      </w:r>
-      <w:proofErr w:type="spellEnd"/>
-      <w:r>
-        <w:t xml:space="preserve">, </w:t>
-      </w:r>
-      <w:proofErr w:type="spellStart"/>
-      <w:r>
-        <w:t>effective_to</w:t>
-      </w:r>
-      <w:proofErr w:type="spellEnd"/>
-      <w:r>
-        <w:t>)</w:t>
-      </w:r>
-    </w:p>
-    <w:p>
-      <w:r>
-        <w:t>) ENGINE=</w:t>
-      </w:r>
-      <w:proofErr w:type="spellStart"/>
-      <w:r>
-        <w:t>InnoDB</w:t>
-      </w:r>
-      <w:proofErr w:type="spellEnd"/>
-      <w:r>
-        <w:t>;</w:t>
+        <w:t xml:space="preserve">    INDEX idx_rent_dates (effective_from, effective_to)</w:t>
+      </w:r>
+    </w:p>
+    <w:p>
+      <w:r>
+        <w:t>) ENGINE=InnoDB;</w:t>
       </w:r>
     </w:p>
     <w:p/>
@@ -829,111 +476,42 @@
     </w:p>
     <w:p>
       <w:r>
+        <w:t xml:space="preserve">    building_id INT NOT NULL,</w:t>
+      </w:r>
+    </w:p>
+    <w:p>
+      <w:r>
+        <w:t xml:space="preserve">    meter_name VARCHAR(150) NOT NULL,</w:t>
+      </w:r>
+    </w:p>
+    <w:p>
+      <w:r>
+        <w:t xml:space="preserve">    meter_type ENUM('personal','common') NOT NULL,</w:t>
+      </w:r>
+    </w:p>
+    <w:p>
+      <w:r>
+        <w:t xml:space="preserve">    status TINYINT(1) DEFAULT 1,</w:t>
+      </w:r>
+    </w:p>
+    <w:p>
+      <w:r>
+        <w:t xml:space="preserve">    created_at DATETIME DEFAULT CURRENT_TIMESTAMP,</w:t>
+      </w:r>
+    </w:p>
+    <w:p>
+      <w:r>
         <w:t xml:space="preserve">    </w:t>
       </w:r>
-      <w:proofErr w:type="spellStart"/>
-      <w:r>
-        <w:t>building_id</w:t>
-      </w:r>
-      <w:proofErr w:type="spellEnd"/>
-      <w:r>
-        <w:t xml:space="preserve"> INT NOT NULL,</w:t>
-      </w:r>
-    </w:p>
-    <w:p>
-      <w:r>
-        <w:t xml:space="preserve">    </w:t>
-      </w:r>
-      <w:proofErr w:type="spellStart"/>
-      <w:r>
-        <w:t>meter_name</w:t>
-      </w:r>
-      <w:proofErr w:type="spellEnd"/>
-      <w:r>
-        <w:t xml:space="preserve"> </w:t>
-      </w:r>
-      <w:proofErr w:type="gramStart"/>
-      <w:r>
-        <w:t>VARCHAR(</w:t>
-      </w:r>
-      <w:proofErr w:type="gramEnd"/>
-      <w:r>
-        <w:t>150) NOT NULL,</w:t>
-      </w:r>
-    </w:p>
-    <w:p>
-      <w:r>
-        <w:t xml:space="preserve">    </w:t>
-      </w:r>
-      <w:proofErr w:type="spellStart"/>
-      <w:r>
-        <w:t>meter_type</w:t>
-      </w:r>
-      <w:proofErr w:type="spellEnd"/>
-      <w:r>
-        <w:t xml:space="preserve"> ENUM('</w:t>
-      </w:r>
-      <w:proofErr w:type="spellStart"/>
-      <w:r>
-        <w:t>personal','common</w:t>
-      </w:r>
-      <w:proofErr w:type="spellEnd"/>
-      <w:r>
-        <w:t>') NOT NULL,</w:t>
-      </w:r>
-    </w:p>
-    <w:p>
-      <w:r>
-        <w:t xml:space="preserve">    status </w:t>
-      </w:r>
-      <w:proofErr w:type="gramStart"/>
-      <w:r>
-        <w:t>TINYINT(</w:t>
-      </w:r>
-      <w:proofErr w:type="gramEnd"/>
-      <w:r>
-        <w:t>1) DEFAULT 1,</w:t>
-      </w:r>
-    </w:p>
-    <w:p>
-      <w:r>
-        <w:t xml:space="preserve">    </w:t>
-      </w:r>
-      <w:proofErr w:type="spellStart"/>
-      <w:r>
-        <w:t>created_at</w:t>
-      </w:r>
-      <w:proofErr w:type="spellEnd"/>
-      <w:r>
-        <w:t xml:space="preserve"> DATETIME DEFAULT CURRENT_TIMESTAMP,</w:t>
-      </w:r>
-    </w:p>
-    <w:p>
-      <w:r>
-        <w:t xml:space="preserve">    </w:t>
-      </w:r>
-    </w:p>
-    <w:p>
-      <w:r>
-        <w:t xml:space="preserve">    CONSTRAINT </w:t>
-      </w:r>
-      <w:proofErr w:type="spellStart"/>
-      <w:r>
-        <w:t>fk_meter_building</w:t>
-      </w:r>
-      <w:proofErr w:type="spellEnd"/>
-    </w:p>
-    <w:p>
-      <w:r>
-        <w:t xml:space="preserve">        FOREIGN KEY (</w:t>
-      </w:r>
-      <w:proofErr w:type="spellStart"/>
-      <w:r>
-        <w:t>building_id</w:t>
-      </w:r>
-      <w:proofErr w:type="spellEnd"/>
-      <w:r>
-        <w:t>) REFERENCES buildings(id)</w:t>
+    </w:p>
+    <w:p>
+      <w:r>
+        <w:t xml:space="preserve">    CONSTRAINT fk_meter_building</w:t>
+      </w:r>
+    </w:p>
+    <w:p>
+      <w:r>
+        <w:t xml:space="preserve">        FOREIGN KEY (building_id) REFERENCES buildings(id)</w:t>
       </w:r>
     </w:p>
     <w:p>
@@ -944,15 +522,7 @@
     </w:p>
     <w:p>
       <w:r>
-        <w:t>) ENGINE=</w:t>
-      </w:r>
-      <w:proofErr w:type="spellStart"/>
-      <w:r>
-        <w:t>InnoDB</w:t>
-      </w:r>
-      <w:proofErr w:type="spellEnd"/>
-      <w:r>
-        <w:t>;</w:t>
+        <w:t>) ENGINE=InnoDB;</w:t>
       </w:r>
     </w:p>
     <w:p/>
@@ -982,15 +552,7 @@
     </w:p>
     <w:p>
       <w:r>
-        <w:t xml:space="preserve">CREATE TABLE </w:t>
-      </w:r>
-      <w:proofErr w:type="spellStart"/>
-      <w:r>
-        <w:t>meter_readings</w:t>
-      </w:r>
-      <w:proofErr w:type="spellEnd"/>
-      <w:r>
-        <w:t xml:space="preserve"> (</w:t>
+        <w:t>CREATE TABLE meter_readings (</w:t>
       </w:r>
     </w:p>
     <w:p>
@@ -1000,174 +562,92 @@
     </w:p>
     <w:p>
       <w:r>
+        <w:t xml:space="preserve">    meter_id INT NOT NULL,</w:t>
+      </w:r>
+    </w:p>
+    <w:p>
+      <w:r>
+        <w:t xml:space="preserve">    reading_date DATE NOT NULL,</w:t>
+      </w:r>
+    </w:p>
+    <w:p>
+      <w:r>
+        <w:t xml:space="preserve">    previous_reading</w:t>
+      </w:r>
+      <w:r>
+        <w:t> INT UNSIGNED NOT NULL</w:t>
+      </w:r>
+      <w:r>
+        <w:t>,</w:t>
+      </w:r>
+    </w:p>
+    <w:p>
+      <w:r>
+        <w:t xml:space="preserve">    current_reading </w:t>
+      </w:r>
+      <w:r>
+        <w:t>INT UNSIGNED NOT NULL</w:t>
+      </w:r>
+      <w:r>
+        <w:t>,</w:t>
+      </w:r>
+    </w:p>
+    <w:p>
+      <w:r>
+        <w:t xml:space="preserve">    units_consumed </w:t>
+      </w:r>
+      <w:r>
+        <w:t>SMALLINT</w:t>
+      </w:r>
+      <w:r>
+        <w:t xml:space="preserve"> </w:t>
+      </w:r>
+      <w:r>
+        <w:t>UNSIGNED NOT NULL</w:t>
+      </w:r>
+      <w:r>
+        <w:t>,</w:t>
+      </w:r>
+    </w:p>
+    <w:p>
+      <w:r>
         <w:t xml:space="preserve">    </w:t>
       </w:r>
-      <w:proofErr w:type="spellStart"/>
-      <w:r>
-        <w:t>meter_id</w:t>
-      </w:r>
-      <w:proofErr w:type="spellEnd"/>
-      <w:r>
-        <w:t xml:space="preserve"> INT NOT NULL,</w:t>
+      <w:r>
+        <w:t>`per_unit_rate` </w:t>
+      </w:r>
+      <w:r>
+        <w:t>DECIMAL(10,2) NOT NULL,</w:t>
+      </w:r>
+    </w:p>
+    <w:p>
+      <w:r>
+        <w:t xml:space="preserve">    total_amount DECIMAL(10,2) NOT NULL,</w:t>
+      </w:r>
+    </w:p>
+    <w:p>
+      <w:r>
+        <w:t xml:space="preserve">    image_path VARCHAR(255) NULL,</w:t>
+      </w:r>
+    </w:p>
+    <w:p>
+      <w:r>
+        <w:t xml:space="preserve">    created_at DATETIME DEFAULT CURRENT_TIMESTAMP,</w:t>
       </w:r>
     </w:p>
     <w:p>
       <w:r>
         <w:t xml:space="preserve">    </w:t>
       </w:r>
-      <w:proofErr w:type="spellStart"/>
-      <w:r>
-        <w:t>reading_date</w:t>
-      </w:r>
-      <w:proofErr w:type="spellEnd"/>
-      <w:r>
-        <w:t xml:space="preserve"> DATE NOT NULL,</w:t>
-      </w:r>
-    </w:p>
-    <w:p>
-      <w:r>
-        <w:t xml:space="preserve">    </w:t>
-      </w:r>
-      <w:proofErr w:type="spellStart"/>
-      <w:r>
-        <w:t>previous_reading</w:t>
-      </w:r>
-      <w:proofErr w:type="spellEnd"/>
-      <w:r>
-        <w:t xml:space="preserve"> </w:t>
-      </w:r>
-      <w:proofErr w:type="gramStart"/>
-      <w:r>
-        <w:t>DECIMAL(</w:t>
-      </w:r>
-      <w:proofErr w:type="gramEnd"/>
-      <w:r>
-        <w:t>10,2) NOT NULL,</w:t>
-      </w:r>
-    </w:p>
-    <w:p>
-      <w:r>
-        <w:t xml:space="preserve">    </w:t>
-      </w:r>
-      <w:proofErr w:type="spellStart"/>
-      <w:r>
-        <w:t>current_reading</w:t>
-      </w:r>
-      <w:proofErr w:type="spellEnd"/>
-      <w:r>
-        <w:t xml:space="preserve"> </w:t>
-      </w:r>
-      <w:proofErr w:type="gramStart"/>
-      <w:r>
-        <w:t>DECIMAL(</w:t>
-      </w:r>
-      <w:proofErr w:type="gramEnd"/>
-      <w:r>
-        <w:t>10,2) NOT NULL,</w:t>
-      </w:r>
-    </w:p>
-    <w:p>
-      <w:r>
-        <w:t xml:space="preserve">    </w:t>
-      </w:r>
-      <w:proofErr w:type="spellStart"/>
-      <w:r>
-        <w:t>units_consumed</w:t>
-      </w:r>
-      <w:proofErr w:type="spellEnd"/>
-      <w:r>
-        <w:t xml:space="preserve"> </w:t>
-      </w:r>
-      <w:proofErr w:type="gramStart"/>
-      <w:r>
-        <w:t>DECIMAL(</w:t>
-      </w:r>
-      <w:proofErr w:type="gramEnd"/>
-      <w:r>
-        <w:t>10,2) NOT NULL,</w:t>
-      </w:r>
-    </w:p>
-    <w:p>
-      <w:r>
-        <w:t xml:space="preserve">    </w:t>
-      </w:r>
-      <w:proofErr w:type="spellStart"/>
-      <w:r>
-        <w:t>total_amount</w:t>
-      </w:r>
-      <w:proofErr w:type="spellEnd"/>
-      <w:r>
-        <w:t xml:space="preserve"> </w:t>
-      </w:r>
-      <w:proofErr w:type="gramStart"/>
-      <w:r>
-        <w:t>DECIMAL(</w:t>
-      </w:r>
-      <w:proofErr w:type="gramEnd"/>
-      <w:r>
-        <w:t>10,2) NOT NULL,</w:t>
-      </w:r>
-    </w:p>
-    <w:p>
-      <w:r>
-        <w:t xml:space="preserve">    </w:t>
-      </w:r>
-      <w:proofErr w:type="spellStart"/>
-      <w:r>
-        <w:t>image_path</w:t>
-      </w:r>
-      <w:proofErr w:type="spellEnd"/>
-      <w:r>
-        <w:t xml:space="preserve"> </w:t>
-      </w:r>
-      <w:proofErr w:type="gramStart"/>
-      <w:r>
-        <w:t>VARCHAR(</w:t>
-      </w:r>
-      <w:proofErr w:type="gramEnd"/>
-      <w:r>
-        <w:t>255) NULL,</w:t>
-      </w:r>
-    </w:p>
-    <w:p>
-      <w:r>
-        <w:t xml:space="preserve">    </w:t>
-      </w:r>
-      <w:proofErr w:type="spellStart"/>
-      <w:r>
-        <w:t>created_at</w:t>
-      </w:r>
-      <w:proofErr w:type="spellEnd"/>
-      <w:r>
-        <w:t xml:space="preserve"> DATETIME DEFAULT CURRENT_TIMESTAMP,</w:t>
-      </w:r>
-    </w:p>
-    <w:p>
-      <w:r>
-        <w:t xml:space="preserve">    </w:t>
-      </w:r>
-    </w:p>
-    <w:p>
-      <w:r>
-        <w:t xml:space="preserve">    CONSTRAINT </w:t>
-      </w:r>
-      <w:proofErr w:type="spellStart"/>
-      <w:r>
-        <w:t>fk_reading_meter</w:t>
-      </w:r>
-      <w:proofErr w:type="spellEnd"/>
-    </w:p>
-    <w:p>
-      <w:r>
-        <w:t xml:space="preserve">        FOREIGN KEY (</w:t>
-      </w:r>
-      <w:proofErr w:type="spellStart"/>
-      <w:r>
-        <w:t>meter_id</w:t>
-      </w:r>
-      <w:proofErr w:type="spellEnd"/>
-      <w:r>
-        <w:t>) REFERENCES meters(id)</w:t>
+    </w:p>
+    <w:p>
+      <w:r>
+        <w:t xml:space="preserve">    CONSTRAINT fk_reading_meter</w:t>
+      </w:r>
+    </w:p>
+    <w:p>
+      <w:r>
+        <w:t xml:space="preserve">        FOREIGN KEY (meter_id) REFERENCES meters(id)</w:t>
       </w:r>
     </w:p>
     <w:p>
@@ -1182,36 +662,12 @@
     </w:p>
     <w:p>
       <w:r>
-        <w:t xml:space="preserve">    INDEX </w:t>
-      </w:r>
-      <w:proofErr w:type="spellStart"/>
-      <w:r>
-        <w:t>idx_reading_date</w:t>
-      </w:r>
-      <w:proofErr w:type="spellEnd"/>
-      <w:r>
-        <w:t xml:space="preserve"> (</w:t>
-      </w:r>
-      <w:proofErr w:type="spellStart"/>
-      <w:r>
-        <w:t>reading_date</w:t>
-      </w:r>
-      <w:proofErr w:type="spellEnd"/>
-      <w:r>
-        <w:t>)</w:t>
-      </w:r>
-    </w:p>
-    <w:p>
-      <w:r>
-        <w:t>) ENGINE=</w:t>
-      </w:r>
-      <w:proofErr w:type="spellStart"/>
-      <w:r>
-        <w:t>InnoDB</w:t>
-      </w:r>
-      <w:proofErr w:type="spellEnd"/>
-      <w:r>
-        <w:t>;</w:t>
+        <w:t xml:space="preserve">    INDEX idx_reading_date (reading_date)</w:t>
+      </w:r>
+    </w:p>
+    <w:p>
+      <w:r>
+        <w:t>) ENGINE=InnoDB;</w:t>
       </w:r>
     </w:p>
     <w:p/>
@@ -1241,15 +697,7 @@
     </w:p>
     <w:p>
       <w:r>
-        <w:t xml:space="preserve">CREATE TABLE </w:t>
-      </w:r>
-      <w:proofErr w:type="spellStart"/>
-      <w:r>
-        <w:t>meter_tenant_mapping</w:t>
-      </w:r>
-      <w:proofErr w:type="spellEnd"/>
-      <w:r>
-        <w:t xml:space="preserve"> (</w:t>
+        <w:t>CREATE TABLE meter_tenant_mapping (</w:t>
       </w:r>
     </w:p>
     <w:p>
@@ -1259,82 +707,37 @@
     </w:p>
     <w:p>
       <w:r>
+        <w:t xml:space="preserve">    meter_id INT NOT NULL,</w:t>
+      </w:r>
+    </w:p>
+    <w:p>
+      <w:r>
+        <w:t xml:space="preserve">    tenant_id INT NOT NULL,</w:t>
+      </w:r>
+    </w:p>
+    <w:p>
+      <w:r>
+        <w:t xml:space="preserve">    effective_from DATE NOT NULL,</w:t>
+      </w:r>
+    </w:p>
+    <w:p>
+      <w:r>
+        <w:t xml:space="preserve">    effective_to DATE NULL,</w:t>
+      </w:r>
+    </w:p>
+    <w:p>
+      <w:r>
         <w:t xml:space="preserve">    </w:t>
       </w:r>
-      <w:proofErr w:type="spellStart"/>
-      <w:r>
-        <w:t>meter_id</w:t>
-      </w:r>
-      <w:proofErr w:type="spellEnd"/>
-      <w:r>
-        <w:t xml:space="preserve"> INT NOT NULL,</w:t>
-      </w:r>
-    </w:p>
-    <w:p>
-      <w:r>
-        <w:t xml:space="preserve">    </w:t>
-      </w:r>
-      <w:proofErr w:type="spellStart"/>
-      <w:r>
-        <w:t>tenant_id</w:t>
-      </w:r>
-      <w:proofErr w:type="spellEnd"/>
-      <w:r>
-        <w:t xml:space="preserve"> INT NOT NULL,</w:t>
-      </w:r>
-    </w:p>
-    <w:p>
-      <w:r>
-        <w:t xml:space="preserve">    </w:t>
-      </w:r>
-      <w:proofErr w:type="spellStart"/>
-      <w:r>
-        <w:t>effective_from</w:t>
-      </w:r>
-      <w:proofErr w:type="spellEnd"/>
-      <w:r>
-        <w:t xml:space="preserve"> DATE NOT NULL,</w:t>
-      </w:r>
-    </w:p>
-    <w:p>
-      <w:r>
-        <w:t xml:space="preserve">    </w:t>
-      </w:r>
-      <w:proofErr w:type="spellStart"/>
-      <w:r>
-        <w:t>effective_to</w:t>
-      </w:r>
-      <w:proofErr w:type="spellEnd"/>
-      <w:r>
-        <w:t xml:space="preserve"> DATE NULL,</w:t>
-      </w:r>
-    </w:p>
-    <w:p>
-      <w:r>
-        <w:t xml:space="preserve">    </w:t>
-      </w:r>
-    </w:p>
-    <w:p>
-      <w:r>
-        <w:t xml:space="preserve">    CONSTRAINT </w:t>
-      </w:r>
-      <w:proofErr w:type="spellStart"/>
-      <w:r>
-        <w:t>fk_mtm_meter</w:t>
-      </w:r>
-      <w:proofErr w:type="spellEnd"/>
-    </w:p>
-    <w:p>
-      <w:r>
-        <w:t xml:space="preserve">        FOREIGN KEY (</w:t>
-      </w:r>
-      <w:proofErr w:type="spellStart"/>
-      <w:r>
-        <w:t>meter_id</w:t>
-      </w:r>
-      <w:proofErr w:type="spellEnd"/>
-      <w:r>
-        <w:t>) REFERENCES meters(id)</w:t>
+    </w:p>
+    <w:p>
+      <w:r>
+        <w:t xml:space="preserve">    CONSTRAINT fk_mtm_meter</w:t>
+      </w:r>
+    </w:p>
+    <w:p>
+      <w:r>
+        <w:t xml:space="preserve">        FOREIGN KEY (meter_id) REFERENCES meters(id)</w:t>
       </w:r>
     </w:p>
     <w:p>
@@ -1349,25 +752,12 @@
     </w:p>
     <w:p>
       <w:r>
-        <w:t xml:space="preserve">    CONSTRAINT </w:t>
-      </w:r>
-      <w:proofErr w:type="spellStart"/>
-      <w:r>
-        <w:t>fk_mtm_tenant</w:t>
-      </w:r>
-      <w:proofErr w:type="spellEnd"/>
-    </w:p>
-    <w:p>
-      <w:r>
-        <w:t xml:space="preserve">        FOREIGN KEY (</w:t>
-      </w:r>
-      <w:proofErr w:type="spellStart"/>
-      <w:r>
-        <w:t>tenant_id</w:t>
-      </w:r>
-      <w:proofErr w:type="spellEnd"/>
-      <w:r>
-        <w:t>) REFERENCES tenants(id)</w:t>
+        <w:t xml:space="preserve">    CONSTRAINT fk_mtm_tenant</w:t>
+      </w:r>
+    </w:p>
+    <w:p>
+      <w:r>
+        <w:t xml:space="preserve">        FOREIGN KEY (tenant_id) REFERENCES tenants(id)</w:t>
       </w:r>
     </w:p>
     <w:p>
@@ -1382,44 +772,12 @@
     </w:p>
     <w:p>
       <w:r>
-        <w:t xml:space="preserve">    INDEX </w:t>
-      </w:r>
-      <w:proofErr w:type="spellStart"/>
-      <w:r>
-        <w:t>idx_mtm_dates</w:t>
-      </w:r>
-      <w:proofErr w:type="spellEnd"/>
-      <w:r>
-        <w:t xml:space="preserve"> (</w:t>
-      </w:r>
-      <w:proofErr w:type="spellStart"/>
-      <w:r>
-        <w:t>effective_from</w:t>
-      </w:r>
-      <w:proofErr w:type="spellEnd"/>
-      <w:r>
-        <w:t xml:space="preserve">, </w:t>
-      </w:r>
-      <w:proofErr w:type="spellStart"/>
-      <w:r>
-        <w:t>effective_to</w:t>
-      </w:r>
-      <w:proofErr w:type="spellEnd"/>
-      <w:r>
-        <w:t>)</w:t>
-      </w:r>
-    </w:p>
-    <w:p>
-      <w:r>
-        <w:t>) ENGINE=</w:t>
-      </w:r>
-      <w:proofErr w:type="spellStart"/>
-      <w:r>
-        <w:t>InnoDB</w:t>
-      </w:r>
-      <w:proofErr w:type="spellEnd"/>
-      <w:r>
-        <w:t>;</w:t>
+        <w:t xml:space="preserve">    INDEX idx_mtm_dates (effective_from, effective_to)</w:t>
+      </w:r>
+    </w:p>
+    <w:p>
+      <w:r>
+        <w:t>) ENGINE=InnoDB;</w:t>
       </w:r>
     </w:p>
     <w:p/>
@@ -1430,6 +788,7 @@
     </w:p>
     <w:p>
       <w:r>
+        <w:lastRenderedPageBreak/>
         <w:t>-- 9️</w:t>
       </w:r>
       <w:r>
@@ -1444,7 +803,6 @@
     </w:p>
     <w:p>
       <w:r>
-        <w:lastRenderedPageBreak/>
         <w:t>-- =====================================================</w:t>
       </w:r>
     </w:p>
@@ -1460,187 +818,62 @@
     </w:p>
     <w:p>
       <w:r>
+        <w:t xml:space="preserve">    tenant_id INT NOT NULL,</w:t>
+      </w:r>
+    </w:p>
+    <w:p>
+      <w:r>
+        <w:t xml:space="preserve">    billing_month DATE NOT NULL,</w:t>
+      </w:r>
+    </w:p>
+    <w:p>
+      <w:r>
+        <w:t xml:space="preserve">    rent_amount DECIMAL(10,2) NOT NULL DEFAULT 0,</w:t>
+      </w:r>
+    </w:p>
+    <w:p>
+      <w:r>
+        <w:t xml:space="preserve">    electricity_amount DECIMAL(10,2) NOT NULL DEFAULT 0,</w:t>
+      </w:r>
+    </w:p>
+    <w:p>
+      <w:r>
+        <w:t xml:space="preserve">    other_charges DECIMAL(10,2) DEFAULT 0,</w:t>
+      </w:r>
+    </w:p>
+    <w:p>
+      <w:r>
+        <w:t xml:space="preserve">    adjustment_amount DECIMAL(10,2) DEFAULT 0,</w:t>
+      </w:r>
+    </w:p>
+    <w:p>
+      <w:r>
+        <w:t xml:space="preserve">    total_amount DECIMAL(10,2) NOT NULL DEFAULT 0,</w:t>
+      </w:r>
+    </w:p>
+    <w:p>
+      <w:r>
+        <w:t xml:space="preserve">    status ENUM('unpaid','paid','partial') DEFAULT 'unpaid',</w:t>
+      </w:r>
+    </w:p>
+    <w:p>
+      <w:r>
+        <w:t xml:space="preserve">    created_at DATETIME DEFAULT CURRENT_TIMESTAMP,</w:t>
+      </w:r>
+    </w:p>
+    <w:p>
+      <w:r>
         <w:t xml:space="preserve">    </w:t>
       </w:r>
-      <w:proofErr w:type="spellStart"/>
-      <w:r>
-        <w:t>tenant_id</w:t>
-      </w:r>
-      <w:proofErr w:type="spellEnd"/>
-      <w:r>
-        <w:t xml:space="preserve"> INT NOT NULL,</w:t>
-      </w:r>
-    </w:p>
-    <w:p>
-      <w:r>
-        <w:t xml:space="preserve">    </w:t>
-      </w:r>
-      <w:proofErr w:type="spellStart"/>
-      <w:r>
-        <w:t>billing_month</w:t>
-      </w:r>
-      <w:proofErr w:type="spellEnd"/>
-      <w:r>
-        <w:t xml:space="preserve"> DATE NOT NULL,</w:t>
-      </w:r>
-    </w:p>
-    <w:p>
-      <w:r>
-        <w:t xml:space="preserve">    </w:t>
-      </w:r>
-      <w:proofErr w:type="spellStart"/>
-      <w:r>
-        <w:t>rent_amount</w:t>
-      </w:r>
-      <w:proofErr w:type="spellEnd"/>
-      <w:r>
-        <w:t xml:space="preserve"> </w:t>
-      </w:r>
-      <w:proofErr w:type="gramStart"/>
-      <w:r>
-        <w:t>DECIMAL(</w:t>
-      </w:r>
-      <w:proofErr w:type="gramEnd"/>
-      <w:r>
-        <w:t>10,2) NOT NULL DEFAULT 0,</w:t>
-      </w:r>
-    </w:p>
-    <w:p>
-      <w:r>
-        <w:t xml:space="preserve">    </w:t>
-      </w:r>
-      <w:proofErr w:type="spellStart"/>
-      <w:r>
-        <w:t>electricity_amount</w:t>
-      </w:r>
-      <w:proofErr w:type="spellEnd"/>
-      <w:r>
-        <w:t xml:space="preserve"> </w:t>
-      </w:r>
-      <w:proofErr w:type="gramStart"/>
-      <w:r>
-        <w:t>DECIMAL(</w:t>
-      </w:r>
-      <w:proofErr w:type="gramEnd"/>
-      <w:r>
-        <w:t>10,2) NOT NULL DEFAULT 0,</w:t>
-      </w:r>
-    </w:p>
-    <w:p>
-      <w:r>
-        <w:t xml:space="preserve">    </w:t>
-      </w:r>
-      <w:proofErr w:type="spellStart"/>
-      <w:r>
-        <w:t>other_charges</w:t>
-      </w:r>
-      <w:proofErr w:type="spellEnd"/>
-      <w:r>
-        <w:t xml:space="preserve"> </w:t>
-      </w:r>
-      <w:proofErr w:type="gramStart"/>
-      <w:r>
-        <w:t>DECIMAL(</w:t>
-      </w:r>
-      <w:proofErr w:type="gramEnd"/>
-      <w:r>
-        <w:t>10,2) DEFAULT 0,</w:t>
-      </w:r>
-    </w:p>
-    <w:p>
-      <w:r>
-        <w:t xml:space="preserve">    </w:t>
-      </w:r>
-      <w:proofErr w:type="spellStart"/>
-      <w:r>
-        <w:t>adjustment_amount</w:t>
-      </w:r>
-      <w:proofErr w:type="spellEnd"/>
-      <w:r>
-        <w:t xml:space="preserve"> </w:t>
-      </w:r>
-      <w:proofErr w:type="gramStart"/>
-      <w:r>
-        <w:t>DECIMAL(</w:t>
-      </w:r>
-      <w:proofErr w:type="gramEnd"/>
-      <w:r>
-        <w:t>10,2) DEFAULT 0,</w:t>
-      </w:r>
-    </w:p>
-    <w:p>
-      <w:r>
-        <w:t xml:space="preserve">    </w:t>
-      </w:r>
-      <w:proofErr w:type="spellStart"/>
-      <w:r>
-        <w:t>total_amount</w:t>
-      </w:r>
-      <w:proofErr w:type="spellEnd"/>
-      <w:r>
-        <w:t xml:space="preserve"> </w:t>
-      </w:r>
-      <w:proofErr w:type="gramStart"/>
-      <w:r>
-        <w:t>DECIMAL(</w:t>
-      </w:r>
-      <w:proofErr w:type="gramEnd"/>
-      <w:r>
-        <w:t>10,2) NOT NULL DEFAULT 0,</w:t>
-      </w:r>
-    </w:p>
-    <w:p>
-      <w:r>
-        <w:t xml:space="preserve">    status ENUM('</w:t>
-      </w:r>
-      <w:proofErr w:type="spellStart"/>
-      <w:r>
-        <w:t>unpaid','paid','partial</w:t>
-      </w:r>
-      <w:proofErr w:type="spellEnd"/>
-      <w:r>
-        <w:t>') DEFAULT 'unpaid',</w:t>
-      </w:r>
-    </w:p>
-    <w:p>
-      <w:r>
-        <w:t xml:space="preserve">    </w:t>
-      </w:r>
-      <w:proofErr w:type="spellStart"/>
-      <w:r>
-        <w:t>created_at</w:t>
-      </w:r>
-      <w:proofErr w:type="spellEnd"/>
-      <w:r>
-        <w:t xml:space="preserve"> DATETIME DEFAULT CURRENT_TIMESTAMP,</w:t>
-      </w:r>
-    </w:p>
-    <w:p>
-      <w:r>
-        <w:t xml:space="preserve">    </w:t>
-      </w:r>
-    </w:p>
-    <w:p>
-      <w:r>
-        <w:t xml:space="preserve">    CONSTRAINT </w:t>
-      </w:r>
-      <w:proofErr w:type="spellStart"/>
-      <w:r>
-        <w:t>fk_billing_tenant</w:t>
-      </w:r>
-      <w:proofErr w:type="spellEnd"/>
-    </w:p>
-    <w:p>
-      <w:r>
-        <w:t xml:space="preserve">        FOREIGN KEY (</w:t>
-      </w:r>
-      <w:proofErr w:type="spellStart"/>
-      <w:r>
-        <w:t>tenant_id</w:t>
-      </w:r>
-      <w:proofErr w:type="spellEnd"/>
-      <w:r>
-        <w:t>) REFERENCES tenants(id)</w:t>
+    </w:p>
+    <w:p>
+      <w:r>
+        <w:t xml:space="preserve">    CONSTRAINT fk_billing_tenant</w:t>
+      </w:r>
+    </w:p>
+    <w:p>
+      <w:r>
+        <w:t xml:space="preserve">        FOREIGN KEY (tenant_id) REFERENCES tenants(id)</w:t>
       </w:r>
     </w:p>
     <w:p>
@@ -1655,36 +888,12 @@
     </w:p>
     <w:p>
       <w:r>
-        <w:t xml:space="preserve">    INDEX </w:t>
-      </w:r>
-      <w:proofErr w:type="spellStart"/>
-      <w:r>
-        <w:t>idx_billing_month</w:t>
-      </w:r>
-      <w:proofErr w:type="spellEnd"/>
-      <w:r>
-        <w:t xml:space="preserve"> (</w:t>
-      </w:r>
-      <w:proofErr w:type="spellStart"/>
-      <w:r>
-        <w:t>billing_month</w:t>
-      </w:r>
-      <w:proofErr w:type="spellEnd"/>
-      <w:r>
-        <w:t>)</w:t>
-      </w:r>
-    </w:p>
-    <w:p>
-      <w:r>
-        <w:t>) ENGINE=</w:t>
-      </w:r>
-      <w:proofErr w:type="spellStart"/>
-      <w:r>
-        <w:t>InnoDB</w:t>
-      </w:r>
-      <w:proofErr w:type="spellEnd"/>
-      <w:r>
-        <w:t>;</w:t>
+        <w:t xml:space="preserve">    INDEX idx_billing_month (billing_month)</w:t>
+      </w:r>
+    </w:p>
+    <w:p>
+      <w:r>
+        <w:t>) ENGINE=InnoDB;</w:t>
       </w:r>
     </w:p>
     <w:sectPr>
@@ -2608,6 +1817,29 @@
       <w:spacing w:val="5"/>
     </w:rPr>
   </w:style>
+  <w:style w:type="character" w:styleId="Hyperlink">
+    <w:name w:val="Hyperlink"/>
+    <w:basedOn w:val="DefaultParagraphFont"/>
+    <w:uiPriority w:val="99"/>
+    <w:unhideWhenUsed/>
+    <w:rsid w:val="00BA5509"/>
+    <w:rPr>
+      <w:color w:val="0563C1" w:themeColor="hyperlink"/>
+      <w:u w:val="single"/>
+    </w:rPr>
+  </w:style>
+  <w:style w:type="character" w:styleId="UnresolvedMention">
+    <w:name w:val="Unresolved Mention"/>
+    <w:basedOn w:val="DefaultParagraphFont"/>
+    <w:uiPriority w:val="99"/>
+    <w:semiHidden/>
+    <w:unhideWhenUsed/>
+    <w:rsid w:val="00BA5509"/>
+    <w:rPr>
+      <w:color w:val="605E5C"/>
+      <w:shd w:val="clear" w:color="auto" w:fill="E1DFDD"/>
+    </w:rPr>
+  </w:style>
 </w:styles>
 </file>
 

</xml_diff>

<commit_message>
rent_history.php page is complete
</commit_message>
<xml_diff>
--- a/DATABASE.docx
+++ b/DATABASE.docx
@@ -3,609 +3,1316 @@
 <w:document xmlns:wpc="http://schemas.microsoft.com/office/word/2010/wordprocessingCanvas" xmlns:cx="http://schemas.microsoft.com/office/drawing/2014/chartex" xmlns:cx1="http://schemas.microsoft.com/office/drawing/2015/9/8/chartex" xmlns:cx2="http://schemas.microsoft.com/office/drawing/2015/10/21/chartex" xmlns:cx3="http://schemas.microsoft.com/office/drawing/2016/5/9/chartex" xmlns:cx4="http://schemas.microsoft.com/office/drawing/2016/5/10/chartex" xmlns:cx5="http://schemas.microsoft.com/office/drawing/2016/5/11/chartex" xmlns:cx6="http://schemas.microsoft.com/office/drawing/2016/5/12/chartex" xmlns:cx7="http://schemas.microsoft.com/office/drawing/2016/5/13/chartex" xmlns:cx8="http://schemas.microsoft.com/office/drawing/2016/5/14/chartex" xmlns:mc="http://schemas.openxmlformats.org/markup-compatibility/2006" xmlns:aink="http://schemas.microsoft.com/office/drawing/2016/ink" xmlns:am3d="http://schemas.microsoft.com/office/drawing/2017/model3d" xmlns:o="urn:schemas-microsoft-com:office:office" xmlns:oel="http://schemas.microsoft.com/office/2019/extlst" xmlns:r="http://schemas.openxmlformats.org/officeDocument/2006/relationships" xmlns:m="http://schemas.openxmlformats.org/officeDocument/2006/math" xmlns:v="urn:schemas-microsoft-com:vml" xmlns:wp14="http://schemas.microsoft.com/office/word/2010/wordprocessingDrawing" xmlns:wp="http://schemas.openxmlformats.org/drawingml/2006/wordprocessingDrawing" xmlns:w10="urn:schemas-microsoft-com:office:word" xmlns:w="http://schemas.openxmlformats.org/wordprocessingml/2006/main" xmlns:w14="http://schemas.microsoft.com/office/word/2010/wordml" xmlns:w15="http://schemas.microsoft.com/office/word/2012/wordml" xmlns:w16cex="http://schemas.microsoft.com/office/word/2018/wordml/cex" xmlns:w16cid="http://schemas.microsoft.com/office/word/2016/wordml/cid" xmlns:w16="http://schemas.microsoft.com/office/word/2018/wordml" xmlns:w16du="http://schemas.microsoft.com/office/word/2023/wordml/word16du" xmlns:w16sdtdh="http://schemas.microsoft.com/office/word/2020/wordml/sdtdatahash" xmlns:w16sdtfl="http://schemas.microsoft.com/office/word/2024/wordml/sdtformatlock" xmlns:w16se="http://schemas.microsoft.com/office/word/2015/wordml/symex" xmlns:wpg="http://schemas.microsoft.com/office/word/2010/wordprocessingGroup" xmlns:wpi="http://schemas.microsoft.com/office/word/2010/wordprocessingInk" xmlns:wne="http://schemas.microsoft.com/office/word/2006/wordml" xmlns:wps="http://schemas.microsoft.com/office/word/2010/wordprocessingShape" mc:Ignorable="w14 w15 w16se w16cid w16 w16cex w16sdtdh w16sdtfl w16du wp14">
   <w:body>
     <w:p>
-      <w:r>
+      <w:pPr>
+        <w:rPr>
+          <w:highlight w:val="yellow"/>
+        </w:rPr>
+      </w:pPr>
+      <w:r>
+        <w:rPr>
+          <w:highlight w:val="yellow"/>
+        </w:rPr>
         <w:t>-- =====================================================</w:t>
       </w:r>
     </w:p>
     <w:p>
-      <w:r>
+      <w:pPr>
+        <w:rPr>
+          <w:highlight w:val="yellow"/>
+        </w:rPr>
+      </w:pPr>
+      <w:r>
+        <w:rPr>
+          <w:highlight w:val="yellow"/>
+        </w:rPr>
         <w:t>-- DATABASE</w:t>
       </w:r>
     </w:p>
     <w:p>
-      <w:r>
+      <w:pPr>
+        <w:rPr>
+          <w:highlight w:val="yellow"/>
+        </w:rPr>
+      </w:pPr>
+      <w:r>
+        <w:rPr>
+          <w:highlight w:val="yellow"/>
+        </w:rPr>
         <w:t>-- =====================================================</w:t>
       </w:r>
     </w:p>
     <w:p>
-      <w:r>
+      <w:pPr>
+        <w:rPr>
+          <w:highlight w:val="yellow"/>
+        </w:rPr>
+      </w:pPr>
+      <w:r>
+        <w:rPr>
+          <w:highlight w:val="yellow"/>
+        </w:rPr>
         <w:t xml:space="preserve">CREATE DATABASE IF NOT EXISTS </w:t>
       </w:r>
       <w:proofErr w:type="spellStart"/>
       <w:r>
+        <w:rPr>
+          <w:highlight w:val="yellow"/>
+        </w:rPr>
         <w:t>rental_management</w:t>
       </w:r>
       <w:proofErr w:type="spellEnd"/>
       <w:r>
+        <w:rPr>
+          <w:highlight w:val="yellow"/>
+        </w:rPr>
         <w:t>;</w:t>
       </w:r>
     </w:p>
     <w:p>
-      <w:r>
+      <w:pPr>
+        <w:rPr>
+          <w:highlight w:val="yellow"/>
+        </w:rPr>
+      </w:pPr>
+      <w:r>
+        <w:rPr>
+          <w:highlight w:val="yellow"/>
+        </w:rPr>
         <w:t xml:space="preserve">USE </w:t>
       </w:r>
       <w:proofErr w:type="spellStart"/>
       <w:r>
+        <w:rPr>
+          <w:highlight w:val="yellow"/>
+        </w:rPr>
         <w:t>rental_management</w:t>
       </w:r>
       <w:proofErr w:type="spellEnd"/>
       <w:r>
+        <w:rPr>
+          <w:highlight w:val="yellow"/>
+        </w:rPr>
         <w:t>;</w:t>
       </w:r>
     </w:p>
-    <w:p/>
-    <w:p>
-      <w:r>
+    <w:p>
+      <w:pPr>
+        <w:rPr>
+          <w:highlight w:val="yellow"/>
+        </w:rPr>
+      </w:pPr>
+    </w:p>
+    <w:p>
+      <w:pPr>
+        <w:rPr>
+          <w:highlight w:val="yellow"/>
+        </w:rPr>
+      </w:pPr>
+      <w:r>
+        <w:rPr>
+          <w:highlight w:val="yellow"/>
+        </w:rPr>
         <w:t>-- =====================================================</w:t>
       </w:r>
     </w:p>
     <w:p>
-      <w:r>
+      <w:pPr>
+        <w:rPr>
+          <w:highlight w:val="yellow"/>
+        </w:rPr>
+      </w:pPr>
+      <w:r>
+        <w:rPr>
+          <w:highlight w:val="yellow"/>
+        </w:rPr>
         <w:t>-- 1️</w:t>
       </w:r>
       <w:r>
         <w:rPr>
           <w:rFonts w:ascii="Segoe UI Symbol" w:hAnsi="Segoe UI Symbol" w:cs="Segoe UI Symbol"/>
+          <w:highlight w:val="yellow"/>
         </w:rPr>
         <w:t>⃣</w:t>
       </w:r>
       <w:r>
+        <w:rPr>
+          <w:highlight w:val="yellow"/>
+        </w:rPr>
         <w:t xml:space="preserve"> BUILDINGS</w:t>
       </w:r>
     </w:p>
     <w:p>
-      <w:r>
+      <w:pPr>
+        <w:rPr>
+          <w:highlight w:val="yellow"/>
+        </w:rPr>
+      </w:pPr>
+      <w:r>
+        <w:rPr>
+          <w:highlight w:val="yellow"/>
+        </w:rPr>
         <w:t>-- =====================================================</w:t>
       </w:r>
     </w:p>
     <w:p>
-      <w:r>
+      <w:pPr>
+        <w:rPr>
+          <w:highlight w:val="yellow"/>
+        </w:rPr>
+      </w:pPr>
+      <w:r>
+        <w:rPr>
+          <w:highlight w:val="yellow"/>
+        </w:rPr>
         <w:t>CREATE TABLE buildings (</w:t>
       </w:r>
     </w:p>
     <w:p>
-      <w:r>
+      <w:pPr>
+        <w:rPr>
+          <w:highlight w:val="yellow"/>
+        </w:rPr>
+      </w:pPr>
+      <w:r>
+        <w:rPr>
+          <w:highlight w:val="yellow"/>
+        </w:rPr>
         <w:t xml:space="preserve">    id INT AUTO_INCREMENT PRIMARY KEY,</w:t>
       </w:r>
     </w:p>
     <w:p>
-      <w:r>
+      <w:pPr>
+        <w:rPr>
+          <w:highlight w:val="yellow"/>
+        </w:rPr>
+      </w:pPr>
+      <w:r>
+        <w:rPr>
+          <w:highlight w:val="yellow"/>
+        </w:rPr>
         <w:t xml:space="preserve">    name </w:t>
       </w:r>
       <w:proofErr w:type="gramStart"/>
       <w:r>
+        <w:rPr>
+          <w:highlight w:val="yellow"/>
+        </w:rPr>
         <w:t>VARCHAR(</w:t>
       </w:r>
       <w:proofErr w:type="gramEnd"/>
       <w:r>
+        <w:rPr>
+          <w:highlight w:val="yellow"/>
+        </w:rPr>
         <w:t>150) NOT NULL,</w:t>
       </w:r>
     </w:p>
     <w:p>
-      <w:r>
+      <w:pPr>
+        <w:rPr>
+          <w:highlight w:val="yellow"/>
+        </w:rPr>
+      </w:pPr>
+      <w:r>
+        <w:rPr>
+          <w:highlight w:val="yellow"/>
+        </w:rPr>
         <w:t xml:space="preserve">    address TEXT NULL,</w:t>
       </w:r>
     </w:p>
     <w:p>
-      <w:r>
+      <w:pPr>
+        <w:rPr>
+          <w:highlight w:val="yellow"/>
+        </w:rPr>
+      </w:pPr>
+      <w:r>
+        <w:rPr>
+          <w:highlight w:val="yellow"/>
+        </w:rPr>
         <w:t xml:space="preserve">    status </w:t>
       </w:r>
       <w:proofErr w:type="gramStart"/>
       <w:r>
+        <w:rPr>
+          <w:highlight w:val="yellow"/>
+        </w:rPr>
         <w:t>TINYINT(</w:t>
       </w:r>
       <w:proofErr w:type="gramEnd"/>
       <w:r>
+        <w:rPr>
+          <w:highlight w:val="yellow"/>
+        </w:rPr>
         <w:t>1) DEFAULT 1,</w:t>
       </w:r>
     </w:p>
     <w:p>
-      <w:r>
-        <w:t xml:space="preserve">    </w:t>
-      </w:r>
-      <w:proofErr w:type="spellStart"/>
-      <w:r>
+      <w:pPr>
+        <w:rPr>
+          <w:highlight w:val="yellow"/>
+        </w:rPr>
+      </w:pPr>
+      <w:r>
+        <w:rPr>
+          <w:highlight w:val="yellow"/>
+        </w:rPr>
+        <w:t xml:space="preserve">    </w:t>
+      </w:r>
+      <w:proofErr w:type="spellStart"/>
+      <w:r>
+        <w:rPr>
+          <w:highlight w:val="yellow"/>
+        </w:rPr>
         <w:t>created_at</w:t>
       </w:r>
       <w:proofErr w:type="spellEnd"/>
       <w:r>
+        <w:rPr>
+          <w:highlight w:val="yellow"/>
+        </w:rPr>
         <w:t xml:space="preserve"> DATETIME DEFAULT CURRENT_TIMESTAMP</w:t>
       </w:r>
     </w:p>
     <w:p>
-      <w:r>
+      <w:pPr>
+        <w:rPr>
+          <w:highlight w:val="yellow"/>
+        </w:rPr>
+      </w:pPr>
+      <w:r>
+        <w:rPr>
+          <w:highlight w:val="yellow"/>
+        </w:rPr>
         <w:t>) ENGINE=</w:t>
       </w:r>
       <w:proofErr w:type="spellStart"/>
       <w:r>
+        <w:rPr>
+          <w:highlight w:val="yellow"/>
+        </w:rPr>
         <w:t>InnoDB</w:t>
       </w:r>
       <w:proofErr w:type="spellEnd"/>
       <w:r>
+        <w:rPr>
+          <w:highlight w:val="yellow"/>
+        </w:rPr>
         <w:t>;</w:t>
       </w:r>
     </w:p>
-    <w:p/>
-    <w:p>
-      <w:r>
+    <w:p>
+      <w:pPr>
+        <w:rPr>
+          <w:highlight w:val="yellow"/>
+        </w:rPr>
+      </w:pPr>
+    </w:p>
+    <w:p>
+      <w:pPr>
+        <w:rPr>
+          <w:highlight w:val="yellow"/>
+        </w:rPr>
+      </w:pPr>
+      <w:r>
+        <w:rPr>
+          <w:highlight w:val="yellow"/>
+        </w:rPr>
         <w:t>-- =====================================================</w:t>
       </w:r>
     </w:p>
     <w:p>
-      <w:r>
+      <w:pPr>
+        <w:rPr>
+          <w:highlight w:val="yellow"/>
+        </w:rPr>
+      </w:pPr>
+      <w:r>
+        <w:rPr>
+          <w:highlight w:val="yellow"/>
+        </w:rPr>
         <w:t>-- 2️</w:t>
       </w:r>
       <w:r>
         <w:rPr>
           <w:rFonts w:ascii="Segoe UI Symbol" w:hAnsi="Segoe UI Symbol" w:cs="Segoe UI Symbol"/>
+          <w:highlight w:val="yellow"/>
         </w:rPr>
         <w:t>⃣</w:t>
       </w:r>
       <w:r>
+        <w:rPr>
+          <w:highlight w:val="yellow"/>
+        </w:rPr>
         <w:t xml:space="preserve"> UNITS (Floor / Shop etc.)</w:t>
       </w:r>
     </w:p>
     <w:p>
-      <w:r>
+      <w:pPr>
+        <w:rPr>
+          <w:highlight w:val="yellow"/>
+        </w:rPr>
+      </w:pPr>
+      <w:r>
+        <w:rPr>
+          <w:highlight w:val="yellow"/>
+        </w:rPr>
         <w:t>-- =====================================================</w:t>
       </w:r>
     </w:p>
     <w:p>
-      <w:r>
+      <w:pPr>
+        <w:rPr>
+          <w:highlight w:val="yellow"/>
+        </w:rPr>
+      </w:pPr>
+      <w:r>
+        <w:rPr>
+          <w:highlight w:val="yellow"/>
+        </w:rPr>
         <w:t>CREATE TABLE units (</w:t>
       </w:r>
     </w:p>
     <w:p>
-      <w:r>
+      <w:pPr>
+        <w:rPr>
+          <w:highlight w:val="yellow"/>
+        </w:rPr>
+      </w:pPr>
+      <w:r>
+        <w:rPr>
+          <w:highlight w:val="yellow"/>
+        </w:rPr>
         <w:t xml:space="preserve">    id INT AUTO_INCREMENT PRIMARY KEY,</w:t>
       </w:r>
     </w:p>
     <w:p>
-      <w:r>
-        <w:t xml:space="preserve">    </w:t>
-      </w:r>
-      <w:proofErr w:type="spellStart"/>
-      <w:r>
+      <w:pPr>
+        <w:rPr>
+          <w:highlight w:val="yellow"/>
+        </w:rPr>
+      </w:pPr>
+      <w:r>
+        <w:rPr>
+          <w:highlight w:val="yellow"/>
+        </w:rPr>
+        <w:t xml:space="preserve">    </w:t>
+      </w:r>
+      <w:proofErr w:type="spellStart"/>
+      <w:r>
+        <w:rPr>
+          <w:highlight w:val="yellow"/>
+        </w:rPr>
         <w:t>building_id</w:t>
       </w:r>
       <w:proofErr w:type="spellEnd"/>
       <w:r>
+        <w:rPr>
+          <w:highlight w:val="yellow"/>
+        </w:rPr>
         <w:t xml:space="preserve"> INT NOT NULL,</w:t>
       </w:r>
     </w:p>
     <w:p>
-      <w:r>
-        <w:t xml:space="preserve">    </w:t>
-      </w:r>
-      <w:proofErr w:type="spellStart"/>
-      <w:r>
+      <w:pPr>
+        <w:rPr>
+          <w:highlight w:val="yellow"/>
+        </w:rPr>
+      </w:pPr>
+      <w:r>
+        <w:rPr>
+          <w:highlight w:val="yellow"/>
+        </w:rPr>
+        <w:t xml:space="preserve">    </w:t>
+      </w:r>
+      <w:proofErr w:type="spellStart"/>
+      <w:r>
+        <w:rPr>
+          <w:highlight w:val="yellow"/>
+        </w:rPr>
         <w:t>unit_name</w:t>
       </w:r>
       <w:proofErr w:type="spellEnd"/>
       <w:r>
+        <w:rPr>
+          <w:highlight w:val="yellow"/>
+        </w:rPr>
         <w:t xml:space="preserve"> </w:t>
       </w:r>
       <w:proofErr w:type="gramStart"/>
       <w:r>
+        <w:rPr>
+          <w:highlight w:val="yellow"/>
+        </w:rPr>
         <w:t>VARCHAR(</w:t>
       </w:r>
       <w:proofErr w:type="gramEnd"/>
       <w:r>
+        <w:rPr>
+          <w:highlight w:val="yellow"/>
+        </w:rPr>
         <w:t>150) NOT NULL,</w:t>
       </w:r>
     </w:p>
     <w:p>
-      <w:r>
+      <w:pPr>
+        <w:rPr>
+          <w:highlight w:val="yellow"/>
+        </w:rPr>
+      </w:pPr>
+      <w:r>
+        <w:rPr>
+          <w:highlight w:val="yellow"/>
+        </w:rPr>
         <w:t xml:space="preserve">    status </w:t>
       </w:r>
       <w:proofErr w:type="gramStart"/>
       <w:r>
+        <w:rPr>
+          <w:highlight w:val="yellow"/>
+        </w:rPr>
         <w:t>TINYINT(</w:t>
       </w:r>
       <w:proofErr w:type="gramEnd"/>
       <w:r>
+        <w:rPr>
+          <w:highlight w:val="yellow"/>
+        </w:rPr>
         <w:t>1) DEFAULT 1,</w:t>
       </w:r>
     </w:p>
     <w:p>
-      <w:r>
-        <w:t xml:space="preserve">    </w:t>
-      </w:r>
-      <w:proofErr w:type="spellStart"/>
-      <w:r>
+      <w:pPr>
+        <w:rPr>
+          <w:highlight w:val="yellow"/>
+        </w:rPr>
+      </w:pPr>
+      <w:r>
+        <w:rPr>
+          <w:highlight w:val="yellow"/>
+        </w:rPr>
+        <w:t xml:space="preserve">    </w:t>
+      </w:r>
+      <w:proofErr w:type="spellStart"/>
+      <w:r>
+        <w:rPr>
+          <w:highlight w:val="yellow"/>
+        </w:rPr>
         <w:t>created_at</w:t>
       </w:r>
       <w:proofErr w:type="spellEnd"/>
       <w:r>
+        <w:rPr>
+          <w:highlight w:val="yellow"/>
+        </w:rPr>
         <w:t xml:space="preserve"> DATETIME DEFAULT CURRENT_TIMESTAMP,</w:t>
       </w:r>
     </w:p>
     <w:p>
-      <w:r>
-        <w:t xml:space="preserve">    </w:t>
-      </w:r>
-    </w:p>
-    <w:p>
-      <w:r>
+      <w:pPr>
+        <w:rPr>
+          <w:highlight w:val="yellow"/>
+        </w:rPr>
+      </w:pPr>
+      <w:r>
+        <w:rPr>
+          <w:highlight w:val="yellow"/>
+        </w:rPr>
+        <w:t xml:space="preserve">    </w:t>
+      </w:r>
+    </w:p>
+    <w:p>
+      <w:pPr>
+        <w:rPr>
+          <w:highlight w:val="yellow"/>
+        </w:rPr>
+      </w:pPr>
+      <w:r>
+        <w:rPr>
+          <w:highlight w:val="yellow"/>
+        </w:rPr>
         <w:t xml:space="preserve">    CONSTRAINT </w:t>
       </w:r>
       <w:proofErr w:type="spellStart"/>
       <w:r>
+        <w:rPr>
+          <w:highlight w:val="yellow"/>
+        </w:rPr>
         <w:t>fk_units_building</w:t>
       </w:r>
       <w:proofErr w:type="spellEnd"/>
     </w:p>
     <w:p>
-      <w:r>
+      <w:pPr>
+        <w:rPr>
+          <w:highlight w:val="yellow"/>
+        </w:rPr>
+      </w:pPr>
+      <w:r>
+        <w:rPr>
+          <w:highlight w:val="yellow"/>
+        </w:rPr>
         <w:t xml:space="preserve">        FOREIGN KEY (</w:t>
       </w:r>
       <w:proofErr w:type="spellStart"/>
       <w:r>
+        <w:rPr>
+          <w:highlight w:val="yellow"/>
+        </w:rPr>
         <w:t>building_id</w:t>
       </w:r>
       <w:proofErr w:type="spellEnd"/>
       <w:r>
+        <w:rPr>
+          <w:highlight w:val="yellow"/>
+        </w:rPr>
         <w:t>) REFERENCES buildings(id)</w:t>
       </w:r>
     </w:p>
     <w:p>
-      <w:r>
+      <w:pPr>
+        <w:rPr>
+          <w:highlight w:val="yellow"/>
+        </w:rPr>
+      </w:pPr>
+      <w:r>
+        <w:rPr>
+          <w:highlight w:val="yellow"/>
+        </w:rPr>
         <w:t xml:space="preserve">        ON DELETE CASCADE</w:t>
       </w:r>
     </w:p>
     <w:p>
-      <w:r>
+      <w:pPr>
+        <w:rPr>
+          <w:highlight w:val="yellow"/>
+        </w:rPr>
+      </w:pPr>
+      <w:r>
+        <w:rPr>
+          <w:highlight w:val="yellow"/>
+        </w:rPr>
         <w:t>) ENGINE=</w:t>
       </w:r>
       <w:proofErr w:type="spellStart"/>
       <w:r>
+        <w:rPr>
+          <w:highlight w:val="yellow"/>
+        </w:rPr>
         <w:t>InnoDB</w:t>
       </w:r>
       <w:proofErr w:type="spellEnd"/>
       <w:r>
+        <w:rPr>
+          <w:highlight w:val="yellow"/>
+        </w:rPr>
         <w:t>;</w:t>
       </w:r>
     </w:p>
-    <w:p/>
-    <w:p>
-      <w:r>
+    <w:p>
+      <w:pPr>
+        <w:rPr>
+          <w:highlight w:val="yellow"/>
+        </w:rPr>
+      </w:pPr>
+    </w:p>
+    <w:p>
+      <w:pPr>
+        <w:rPr>
+          <w:highlight w:val="yellow"/>
+        </w:rPr>
+      </w:pPr>
+      <w:r>
+        <w:rPr>
+          <w:highlight w:val="yellow"/>
+        </w:rPr>
         <w:t>-- =====================================================</w:t>
       </w:r>
     </w:p>
     <w:p>
-      <w:r>
+      <w:pPr>
+        <w:rPr>
+          <w:highlight w:val="yellow"/>
+        </w:rPr>
+      </w:pPr>
+      <w:r>
+        <w:rPr>
+          <w:highlight w:val="yellow"/>
+        </w:rPr>
         <w:t>-- 3️</w:t>
       </w:r>
       <w:r>
         <w:rPr>
           <w:rFonts w:ascii="Segoe UI Symbol" w:hAnsi="Segoe UI Symbol" w:cs="Segoe UI Symbol"/>
+          <w:highlight w:val="yellow"/>
         </w:rPr>
         <w:t>⃣</w:t>
       </w:r>
       <w:r>
+        <w:rPr>
+          <w:highlight w:val="yellow"/>
+        </w:rPr>
         <w:t xml:space="preserve"> TENANTS</w:t>
       </w:r>
     </w:p>
     <w:p>
-      <w:r>
+      <w:pPr>
+        <w:rPr>
+          <w:highlight w:val="yellow"/>
+        </w:rPr>
+      </w:pPr>
+      <w:r>
+        <w:rPr>
+          <w:highlight w:val="yellow"/>
+        </w:rPr>
         <w:t>-- =====================================================</w:t>
       </w:r>
     </w:p>
     <w:p>
-      <w:r>
+      <w:pPr>
+        <w:rPr>
+          <w:highlight w:val="yellow"/>
+        </w:rPr>
+      </w:pPr>
+      <w:r>
+        <w:rPr>
+          <w:highlight w:val="yellow"/>
+        </w:rPr>
         <w:t>CREATE TABLE tenants (</w:t>
       </w:r>
     </w:p>
     <w:p>
-      <w:r>
+      <w:pPr>
+        <w:rPr>
+          <w:highlight w:val="yellow"/>
+        </w:rPr>
+      </w:pPr>
+      <w:r>
+        <w:rPr>
+          <w:highlight w:val="yellow"/>
+        </w:rPr>
         <w:t xml:space="preserve">    id INT AUTO_INCREMENT PRIMARY KEY,</w:t>
       </w:r>
     </w:p>
     <w:p>
-      <w:r>
+      <w:pPr>
+        <w:rPr>
+          <w:highlight w:val="yellow"/>
+        </w:rPr>
+      </w:pPr>
+      <w:r>
+        <w:rPr>
+          <w:highlight w:val="yellow"/>
+        </w:rPr>
         <w:t xml:space="preserve">    name </w:t>
       </w:r>
       <w:proofErr w:type="gramStart"/>
       <w:r>
+        <w:rPr>
+          <w:highlight w:val="yellow"/>
+        </w:rPr>
         <w:t>VARCHAR(</w:t>
       </w:r>
       <w:proofErr w:type="gramEnd"/>
       <w:r>
+        <w:rPr>
+          <w:highlight w:val="yellow"/>
+        </w:rPr>
         <w:t>150) NOT NULL,</w:t>
       </w:r>
     </w:p>
     <w:p>
-      <w:r>
+      <w:pPr>
+        <w:rPr>
+          <w:highlight w:val="yellow"/>
+        </w:rPr>
+      </w:pPr>
+      <w:r>
+        <w:rPr>
+          <w:highlight w:val="yellow"/>
+        </w:rPr>
         <w:t xml:space="preserve">    mobile </w:t>
       </w:r>
       <w:proofErr w:type="gramStart"/>
       <w:r>
+        <w:rPr>
+          <w:highlight w:val="yellow"/>
+        </w:rPr>
         <w:t>CHAR(</w:t>
       </w:r>
       <w:proofErr w:type="gramEnd"/>
       <w:r>
-        <w:t>10)</w:t>
-      </w:r>
-      <w:r>
-        <w:t xml:space="preserve"> NULL,</w:t>
-      </w:r>
-    </w:p>
-    <w:p>
-      <w:r>
-        <w:t xml:space="preserve">    </w:t>
-      </w:r>
-      <w:proofErr w:type="spellStart"/>
-      <w:r>
+        <w:rPr>
+          <w:highlight w:val="yellow"/>
+        </w:rPr>
+        <w:t>10) NULL,</w:t>
+      </w:r>
+    </w:p>
+    <w:p>
+      <w:pPr>
+        <w:rPr>
+          <w:highlight w:val="yellow"/>
+        </w:rPr>
+      </w:pPr>
+      <w:r>
+        <w:rPr>
+          <w:highlight w:val="yellow"/>
+        </w:rPr>
+        <w:t xml:space="preserve">    </w:t>
+      </w:r>
+      <w:proofErr w:type="spellStart"/>
+      <w:r>
+        <w:rPr>
+          <w:highlight w:val="yellow"/>
+        </w:rPr>
         <w:t>id_proof</w:t>
       </w:r>
       <w:proofErr w:type="spellEnd"/>
       <w:r>
+        <w:rPr>
+          <w:highlight w:val="yellow"/>
+        </w:rPr>
         <w:t xml:space="preserve"> </w:t>
       </w:r>
       <w:proofErr w:type="gramStart"/>
       <w:r>
+        <w:rPr>
+          <w:highlight w:val="yellow"/>
+        </w:rPr>
         <w:t>VARCHAR(</w:t>
       </w:r>
       <w:proofErr w:type="gramEnd"/>
       <w:r>
+        <w:rPr>
+          <w:highlight w:val="yellow"/>
+        </w:rPr>
         <w:t>255) NULL,</w:t>
       </w:r>
     </w:p>
     <w:p>
-      <w:r>
+      <w:pPr>
+        <w:rPr>
+          <w:highlight w:val="yellow"/>
+        </w:rPr>
+      </w:pPr>
+      <w:r>
+        <w:rPr>
+          <w:highlight w:val="yellow"/>
+        </w:rPr>
         <w:t xml:space="preserve">    status ENUM('</w:t>
       </w:r>
       <w:proofErr w:type="spellStart"/>
       <w:r>
+        <w:rPr>
+          <w:highlight w:val="yellow"/>
+        </w:rPr>
         <w:t>active','inactive</w:t>
       </w:r>
       <w:proofErr w:type="spellEnd"/>
       <w:r>
+        <w:rPr>
+          <w:highlight w:val="yellow"/>
+        </w:rPr>
         <w:t>') DEFAULT 'active',</w:t>
       </w:r>
     </w:p>
     <w:p>
-      <w:r>
-        <w:t xml:space="preserve">    </w:t>
-      </w:r>
-      <w:proofErr w:type="spellStart"/>
-      <w:r>
+      <w:pPr>
+        <w:rPr>
+          <w:highlight w:val="yellow"/>
+        </w:rPr>
+      </w:pPr>
+      <w:r>
+        <w:rPr>
+          <w:highlight w:val="yellow"/>
+        </w:rPr>
+        <w:t xml:space="preserve">    </w:t>
+      </w:r>
+      <w:proofErr w:type="spellStart"/>
+      <w:r>
+        <w:rPr>
+          <w:highlight w:val="yellow"/>
+        </w:rPr>
         <w:t>created_at</w:t>
       </w:r>
       <w:proofErr w:type="spellEnd"/>
       <w:r>
+        <w:rPr>
+          <w:highlight w:val="yellow"/>
+        </w:rPr>
         <w:t xml:space="preserve"> DATETIME DEFAULT CURRENT_TIMESTAMP</w:t>
       </w:r>
     </w:p>
     <w:p>
-      <w:r>
+      <w:pPr>
+        <w:rPr>
+          <w:highlight w:val="yellow"/>
+        </w:rPr>
+      </w:pPr>
+      <w:r>
+        <w:rPr>
+          <w:highlight w:val="yellow"/>
+        </w:rPr>
         <w:t>) ENGINE=</w:t>
       </w:r>
       <w:proofErr w:type="spellStart"/>
       <w:r>
+        <w:rPr>
+          <w:highlight w:val="yellow"/>
+        </w:rPr>
         <w:t>InnoDB</w:t>
       </w:r>
       <w:proofErr w:type="spellEnd"/>
       <w:r>
+        <w:rPr>
+          <w:highlight w:val="yellow"/>
+        </w:rPr>
         <w:t>;</w:t>
       </w:r>
     </w:p>
-    <w:p/>
-    <w:p>
-      <w:r>
+    <w:p>
+      <w:pPr>
+        <w:rPr>
+          <w:highlight w:val="yellow"/>
+        </w:rPr>
+      </w:pPr>
+    </w:p>
+    <w:p>
+      <w:pPr>
+        <w:rPr>
+          <w:highlight w:val="yellow"/>
+        </w:rPr>
+      </w:pPr>
+      <w:r>
+        <w:rPr>
+          <w:highlight w:val="yellow"/>
+        </w:rPr>
         <w:t>-- =====================================================</w:t>
       </w:r>
     </w:p>
     <w:p>
-      <w:r>
+      <w:pPr>
+        <w:rPr>
+          <w:highlight w:val="yellow"/>
+        </w:rPr>
+      </w:pPr>
+      <w:r>
+        <w:rPr>
+          <w:highlight w:val="yellow"/>
+        </w:rPr>
         <w:t>-- 4️</w:t>
       </w:r>
       <w:r>
         <w:rPr>
           <w:rFonts w:ascii="Segoe UI Symbol" w:hAnsi="Segoe UI Symbol" w:cs="Segoe UI Symbol"/>
+          <w:highlight w:val="yellow"/>
         </w:rPr>
         <w:t>⃣</w:t>
       </w:r>
       <w:r>
+        <w:rPr>
+          <w:highlight w:val="yellow"/>
+        </w:rPr>
         <w:t xml:space="preserve"> TENANT UNIT MAPPING (Shifting / History)</w:t>
       </w:r>
     </w:p>
     <w:p>
-      <w:r>
+      <w:pPr>
+        <w:rPr>
+          <w:highlight w:val="yellow"/>
+        </w:rPr>
+      </w:pPr>
+      <w:r>
+        <w:rPr>
+          <w:highlight w:val="yellow"/>
+        </w:rPr>
         <w:t>-- =====================================================</w:t>
       </w:r>
     </w:p>
     <w:p>
-      <w:r>
+      <w:pPr>
+        <w:rPr>
+          <w:highlight w:val="yellow"/>
+        </w:rPr>
+      </w:pPr>
+      <w:r>
+        <w:rPr>
+          <w:highlight w:val="yellow"/>
+        </w:rPr>
         <w:lastRenderedPageBreak/>
         <w:t xml:space="preserve">CREATE TABLE </w:t>
       </w:r>
       <w:proofErr w:type="spellStart"/>
       <w:r>
+        <w:rPr>
+          <w:highlight w:val="yellow"/>
+        </w:rPr>
         <w:t>tenant_unit_mapping</w:t>
       </w:r>
       <w:proofErr w:type="spellEnd"/>
       <w:r>
+        <w:rPr>
+          <w:highlight w:val="yellow"/>
+        </w:rPr>
         <w:t xml:space="preserve"> (</w:t>
       </w:r>
     </w:p>
     <w:p>
-      <w:r>
+      <w:pPr>
+        <w:rPr>
+          <w:highlight w:val="yellow"/>
+        </w:rPr>
+      </w:pPr>
+      <w:r>
+        <w:rPr>
+          <w:highlight w:val="yellow"/>
+        </w:rPr>
         <w:t xml:space="preserve">    id INT AUTO_INCREMENT PRIMARY KEY,</w:t>
       </w:r>
     </w:p>
     <w:p>
-      <w:r>
-        <w:t xml:space="preserve">    </w:t>
-      </w:r>
-      <w:proofErr w:type="spellStart"/>
-      <w:r>
+      <w:pPr>
+        <w:rPr>
+          <w:highlight w:val="yellow"/>
+        </w:rPr>
+      </w:pPr>
+      <w:r>
+        <w:rPr>
+          <w:highlight w:val="yellow"/>
+        </w:rPr>
+        <w:t xml:space="preserve">    </w:t>
+      </w:r>
+      <w:proofErr w:type="spellStart"/>
+      <w:r>
+        <w:rPr>
+          <w:highlight w:val="yellow"/>
+        </w:rPr>
         <w:t>tenant_id</w:t>
       </w:r>
       <w:proofErr w:type="spellEnd"/>
       <w:r>
+        <w:rPr>
+          <w:highlight w:val="yellow"/>
+        </w:rPr>
         <w:t xml:space="preserve"> INT NOT NULL,</w:t>
       </w:r>
     </w:p>
     <w:p>
-      <w:r>
-        <w:t xml:space="preserve">    </w:t>
-      </w:r>
-      <w:proofErr w:type="spellStart"/>
-      <w:r>
+      <w:pPr>
+        <w:rPr>
+          <w:highlight w:val="yellow"/>
+        </w:rPr>
+      </w:pPr>
+      <w:r>
+        <w:rPr>
+          <w:highlight w:val="yellow"/>
+        </w:rPr>
+        <w:t xml:space="preserve">    </w:t>
+      </w:r>
+      <w:proofErr w:type="spellStart"/>
+      <w:r>
+        <w:rPr>
+          <w:highlight w:val="yellow"/>
+        </w:rPr>
         <w:t>unit_id</w:t>
       </w:r>
       <w:proofErr w:type="spellEnd"/>
       <w:r>
+        <w:rPr>
+          <w:highlight w:val="yellow"/>
+        </w:rPr>
         <w:t xml:space="preserve"> INT NOT NULL,</w:t>
       </w:r>
     </w:p>
     <w:p>
-      <w:r>
-        <w:t xml:space="preserve">    </w:t>
-      </w:r>
-      <w:proofErr w:type="spellStart"/>
-      <w:r>
+      <w:pPr>
+        <w:rPr>
+          <w:highlight w:val="yellow"/>
+        </w:rPr>
+      </w:pPr>
+      <w:r>
+        <w:rPr>
+          <w:highlight w:val="yellow"/>
+        </w:rPr>
+        <w:t xml:space="preserve">    </w:t>
+      </w:r>
+      <w:proofErr w:type="spellStart"/>
+      <w:r>
+        <w:rPr>
+          <w:highlight w:val="yellow"/>
+        </w:rPr>
         <w:t>effective_from</w:t>
       </w:r>
       <w:proofErr w:type="spellEnd"/>
       <w:r>
+        <w:rPr>
+          <w:highlight w:val="yellow"/>
+        </w:rPr>
         <w:t xml:space="preserve"> DATE NOT NULL,</w:t>
       </w:r>
     </w:p>
     <w:p>
-      <w:r>
-        <w:t xml:space="preserve">    </w:t>
-      </w:r>
-      <w:proofErr w:type="spellStart"/>
-      <w:r>
+      <w:pPr>
+        <w:rPr>
+          <w:highlight w:val="yellow"/>
+        </w:rPr>
+      </w:pPr>
+      <w:r>
+        <w:rPr>
+          <w:highlight w:val="yellow"/>
+        </w:rPr>
+        <w:t xml:space="preserve">    </w:t>
+      </w:r>
+      <w:proofErr w:type="spellStart"/>
+      <w:r>
+        <w:rPr>
+          <w:highlight w:val="yellow"/>
+        </w:rPr>
         <w:t>effective_to</w:t>
       </w:r>
       <w:proofErr w:type="spellEnd"/>
       <w:r>
+        <w:rPr>
+          <w:highlight w:val="yellow"/>
+        </w:rPr>
         <w:t xml:space="preserve"> DATE NULL,</w:t>
       </w:r>
     </w:p>
     <w:p>
-      <w:r>
-        <w:t xml:space="preserve">    </w:t>
-      </w:r>
-    </w:p>
-    <w:p>
-      <w:r>
+      <w:pPr>
+        <w:rPr>
+          <w:highlight w:val="yellow"/>
+        </w:rPr>
+      </w:pPr>
+      <w:r>
+        <w:rPr>
+          <w:highlight w:val="yellow"/>
+        </w:rPr>
+        <w:t xml:space="preserve">    </w:t>
+      </w:r>
+    </w:p>
+    <w:p>
+      <w:pPr>
+        <w:rPr>
+          <w:highlight w:val="yellow"/>
+        </w:rPr>
+      </w:pPr>
+      <w:r>
+        <w:rPr>
+          <w:highlight w:val="yellow"/>
+        </w:rPr>
         <w:t xml:space="preserve">    CONSTRAINT </w:t>
       </w:r>
       <w:proofErr w:type="spellStart"/>
       <w:r>
+        <w:rPr>
+          <w:highlight w:val="yellow"/>
+        </w:rPr>
         <w:t>fk_tum_tenant</w:t>
       </w:r>
       <w:proofErr w:type="spellEnd"/>
     </w:p>
     <w:p>
-      <w:r>
+      <w:pPr>
+        <w:rPr>
+          <w:highlight w:val="yellow"/>
+        </w:rPr>
+      </w:pPr>
+      <w:r>
+        <w:rPr>
+          <w:highlight w:val="yellow"/>
+        </w:rPr>
         <w:t xml:space="preserve">        FOREIGN KEY (</w:t>
       </w:r>
       <w:proofErr w:type="spellStart"/>
       <w:r>
+        <w:rPr>
+          <w:highlight w:val="yellow"/>
+        </w:rPr>
         <w:t>tenant_id</w:t>
       </w:r>
       <w:proofErr w:type="spellEnd"/>
       <w:r>
+        <w:rPr>
+          <w:highlight w:val="yellow"/>
+        </w:rPr>
         <w:t>) REFERENCES tenants(id)</w:t>
       </w:r>
     </w:p>
     <w:p>
-      <w:r>
+      <w:pPr>
+        <w:rPr>
+          <w:highlight w:val="yellow"/>
+        </w:rPr>
+      </w:pPr>
+      <w:r>
+        <w:rPr>
+          <w:highlight w:val="yellow"/>
+        </w:rPr>
         <w:t xml:space="preserve">        ON DELETE CASCADE,</w:t>
       </w:r>
     </w:p>
     <w:p>
-      <w:r>
+      <w:pPr>
+        <w:rPr>
+          <w:highlight w:val="yellow"/>
+        </w:rPr>
+      </w:pPr>
+      <w:r>
+        <w:rPr>
+          <w:highlight w:val="yellow"/>
+        </w:rPr>
         <w:t xml:space="preserve">        </w:t>
       </w:r>
     </w:p>
     <w:p>
-      <w:r>
+      <w:pPr>
+        <w:rPr>
+          <w:highlight w:val="yellow"/>
+        </w:rPr>
+      </w:pPr>
+      <w:r>
+        <w:rPr>
+          <w:highlight w:val="yellow"/>
+        </w:rPr>
         <w:t xml:space="preserve">    CONSTRAINT </w:t>
       </w:r>
       <w:proofErr w:type="spellStart"/>
       <w:r>
+        <w:rPr>
+          <w:highlight w:val="yellow"/>
+        </w:rPr>
         <w:t>fk_tum_unit</w:t>
       </w:r>
       <w:proofErr w:type="spellEnd"/>
     </w:p>
     <w:p>
-      <w:r>
+      <w:pPr>
+        <w:rPr>
+          <w:highlight w:val="yellow"/>
+        </w:rPr>
+      </w:pPr>
+      <w:r>
+        <w:rPr>
+          <w:highlight w:val="yellow"/>
+        </w:rPr>
         <w:t xml:space="preserve">        FOREIGN KEY (</w:t>
       </w:r>
       <w:proofErr w:type="spellStart"/>
       <w:r>
+        <w:rPr>
+          <w:highlight w:val="yellow"/>
+        </w:rPr>
         <w:t>unit_id</w:t>
       </w:r>
       <w:proofErr w:type="spellEnd"/>
       <w:r>
+        <w:rPr>
+          <w:highlight w:val="yellow"/>
+        </w:rPr>
         <w:t>) REFERENCES units(id)</w:t>
       </w:r>
     </w:p>
     <w:p>
-      <w:r>
+      <w:pPr>
+        <w:rPr>
+          <w:highlight w:val="yellow"/>
+        </w:rPr>
+      </w:pPr>
+      <w:r>
+        <w:rPr>
+          <w:highlight w:val="yellow"/>
+        </w:rPr>
         <w:t xml:space="preserve">        ON DELETE CASCADE,</w:t>
       </w:r>
     </w:p>
     <w:p>
-      <w:r>
+      <w:pPr>
+        <w:rPr>
+          <w:highlight w:val="yellow"/>
+        </w:rPr>
+      </w:pPr>
+      <w:r>
+        <w:rPr>
+          <w:highlight w:val="yellow"/>
+        </w:rPr>
         <w:t xml:space="preserve">        </w:t>
       </w:r>
     </w:p>
     <w:p>
-      <w:r>
+      <w:pPr>
+        <w:rPr>
+          <w:highlight w:val="yellow"/>
+        </w:rPr>
+      </w:pPr>
+      <w:r>
+        <w:rPr>
+          <w:highlight w:val="yellow"/>
+        </w:rPr>
         <w:t xml:space="preserve">    INDEX </w:t>
       </w:r>
       <w:proofErr w:type="spellStart"/>
       <w:r>
+        <w:rPr>
+          <w:highlight w:val="yellow"/>
+        </w:rPr>
         <w:t>idx_tum_dates</w:t>
       </w:r>
       <w:proofErr w:type="spellEnd"/>
       <w:r>
+        <w:rPr>
+          <w:highlight w:val="yellow"/>
+        </w:rPr>
         <w:t xml:space="preserve"> (</w:t>
       </w:r>
       <w:proofErr w:type="spellStart"/>
       <w:r>
+        <w:rPr>
+          <w:highlight w:val="yellow"/>
+        </w:rPr>
         <w:t>effective_from</w:t>
       </w:r>
       <w:proofErr w:type="spellEnd"/>
       <w:r>
+        <w:rPr>
+          <w:highlight w:val="yellow"/>
+        </w:rPr>
         <w:t xml:space="preserve">, </w:t>
       </w:r>
       <w:proofErr w:type="spellStart"/>
       <w:r>
+        <w:rPr>
+          <w:highlight w:val="yellow"/>
+        </w:rPr>
         <w:t>effective_to</w:t>
       </w:r>
       <w:proofErr w:type="spellEnd"/>
       <w:r>
+        <w:rPr>
+          <w:highlight w:val="yellow"/>
+        </w:rPr>
         <w:t>)</w:t>
       </w:r>
     </w:p>
     <w:p>
       <w:r>
+        <w:rPr>
+          <w:highlight w:val="yellow"/>
+        </w:rPr>
         <w:t>) ENGINE=</w:t>
       </w:r>
       <w:proofErr w:type="spellStart"/>
       <w:r>
+        <w:rPr>
+          <w:highlight w:val="yellow"/>
+        </w:rPr>
         <w:t>InnoDB</w:t>
       </w:r>
       <w:proofErr w:type="spellEnd"/>
       <w:r>
+        <w:rPr>
+          <w:highlight w:val="yellow"/>
+        </w:rPr>
         <w:t>;</w:t>
       </w:r>
     </w:p>
@@ -794,406 +1501,847 @@
     </w:p>
     <w:p/>
     <w:p>
-      <w:r>
+      <w:pPr>
+        <w:rPr>
+          <w:highlight w:val="yellow"/>
+        </w:rPr>
+      </w:pPr>
+      <w:r>
+        <w:rPr>
+          <w:highlight w:val="yellow"/>
+        </w:rPr>
         <w:t>-- =====================================================</w:t>
       </w:r>
     </w:p>
     <w:p>
-      <w:r>
+      <w:pPr>
+        <w:rPr>
+          <w:highlight w:val="yellow"/>
+        </w:rPr>
+      </w:pPr>
+      <w:r>
+        <w:rPr>
+          <w:highlight w:val="yellow"/>
+        </w:rPr>
         <w:t>-- 6️</w:t>
       </w:r>
       <w:r>
         <w:rPr>
           <w:rFonts w:ascii="Segoe UI Symbol" w:hAnsi="Segoe UI Symbol" w:cs="Segoe UI Symbol"/>
+          <w:highlight w:val="yellow"/>
         </w:rPr>
         <w:t>⃣</w:t>
       </w:r>
       <w:r>
+        <w:rPr>
+          <w:highlight w:val="yellow"/>
+        </w:rPr>
         <w:t xml:space="preserve"> METERS (Personal + Common)</w:t>
       </w:r>
     </w:p>
     <w:p>
-      <w:r>
+      <w:pPr>
+        <w:rPr>
+          <w:highlight w:val="yellow"/>
+        </w:rPr>
+      </w:pPr>
+      <w:r>
+        <w:rPr>
+          <w:highlight w:val="yellow"/>
+        </w:rPr>
         <w:t>-- =====================================================</w:t>
       </w:r>
     </w:p>
     <w:p>
-      <w:r>
+      <w:pPr>
+        <w:rPr>
+          <w:highlight w:val="yellow"/>
+        </w:rPr>
+      </w:pPr>
+      <w:r>
+        <w:rPr>
+          <w:highlight w:val="yellow"/>
+        </w:rPr>
         <w:t>CREATE TABLE meters (</w:t>
       </w:r>
     </w:p>
     <w:p>
-      <w:r>
+      <w:pPr>
+        <w:rPr>
+          <w:highlight w:val="yellow"/>
+        </w:rPr>
+      </w:pPr>
+      <w:r>
+        <w:rPr>
+          <w:highlight w:val="yellow"/>
+        </w:rPr>
         <w:t xml:space="preserve">    id INT AUTO_INCREMENT PRIMARY KEY,</w:t>
       </w:r>
     </w:p>
     <w:p>
-      <w:r>
-        <w:t xml:space="preserve">    </w:t>
-      </w:r>
-      <w:proofErr w:type="spellStart"/>
-      <w:r>
+      <w:pPr>
+        <w:rPr>
+          <w:highlight w:val="yellow"/>
+        </w:rPr>
+      </w:pPr>
+      <w:r>
+        <w:rPr>
+          <w:highlight w:val="yellow"/>
+        </w:rPr>
+        <w:t xml:space="preserve">    </w:t>
+      </w:r>
+      <w:proofErr w:type="spellStart"/>
+      <w:r>
+        <w:rPr>
+          <w:highlight w:val="yellow"/>
+        </w:rPr>
         <w:t>building_id</w:t>
       </w:r>
       <w:proofErr w:type="spellEnd"/>
       <w:r>
+        <w:rPr>
+          <w:highlight w:val="yellow"/>
+        </w:rPr>
         <w:t xml:space="preserve"> INT NOT NULL,</w:t>
       </w:r>
     </w:p>
     <w:p>
-      <w:r>
-        <w:t xml:space="preserve">    </w:t>
-      </w:r>
-      <w:proofErr w:type="spellStart"/>
-      <w:r>
+      <w:pPr>
+        <w:rPr>
+          <w:highlight w:val="yellow"/>
+        </w:rPr>
+      </w:pPr>
+      <w:r>
+        <w:rPr>
+          <w:highlight w:val="yellow"/>
+        </w:rPr>
+        <w:t xml:space="preserve">    </w:t>
+      </w:r>
+      <w:proofErr w:type="spellStart"/>
+      <w:r>
+        <w:rPr>
+          <w:highlight w:val="yellow"/>
+        </w:rPr>
         <w:t>meter_name</w:t>
       </w:r>
       <w:proofErr w:type="spellEnd"/>
       <w:r>
+        <w:rPr>
+          <w:highlight w:val="yellow"/>
+        </w:rPr>
         <w:t xml:space="preserve"> </w:t>
       </w:r>
       <w:proofErr w:type="gramStart"/>
       <w:r>
+        <w:rPr>
+          <w:highlight w:val="yellow"/>
+        </w:rPr>
         <w:t>VARCHAR(</w:t>
       </w:r>
       <w:proofErr w:type="gramEnd"/>
       <w:r>
+        <w:rPr>
+          <w:highlight w:val="yellow"/>
+        </w:rPr>
         <w:t>150) NOT NULL,</w:t>
       </w:r>
     </w:p>
     <w:p>
-      <w:r>
-        <w:t xml:space="preserve">    </w:t>
-      </w:r>
-      <w:proofErr w:type="spellStart"/>
-      <w:r>
+      <w:pPr>
+        <w:rPr>
+          <w:highlight w:val="yellow"/>
+        </w:rPr>
+      </w:pPr>
+      <w:r>
+        <w:rPr>
+          <w:highlight w:val="yellow"/>
+        </w:rPr>
+        <w:t xml:space="preserve">    </w:t>
+      </w:r>
+      <w:proofErr w:type="spellStart"/>
+      <w:r>
+        <w:rPr>
+          <w:highlight w:val="yellow"/>
+        </w:rPr>
         <w:t>meter_type</w:t>
       </w:r>
       <w:proofErr w:type="spellEnd"/>
       <w:r>
+        <w:rPr>
+          <w:highlight w:val="yellow"/>
+        </w:rPr>
         <w:t xml:space="preserve"> ENUM('</w:t>
       </w:r>
       <w:proofErr w:type="spellStart"/>
       <w:r>
+        <w:rPr>
+          <w:highlight w:val="yellow"/>
+        </w:rPr>
         <w:t>personal','common</w:t>
       </w:r>
       <w:proofErr w:type="spellEnd"/>
       <w:r>
+        <w:rPr>
+          <w:highlight w:val="yellow"/>
+        </w:rPr>
         <w:t>') NOT NULL,</w:t>
       </w:r>
     </w:p>
     <w:p>
-      <w:r>
+      <w:pPr>
+        <w:rPr>
+          <w:highlight w:val="yellow"/>
+        </w:rPr>
+      </w:pPr>
+      <w:r>
+        <w:rPr>
+          <w:highlight w:val="yellow"/>
+        </w:rPr>
         <w:t xml:space="preserve">    status </w:t>
       </w:r>
       <w:proofErr w:type="gramStart"/>
       <w:r>
+        <w:rPr>
+          <w:highlight w:val="yellow"/>
+        </w:rPr>
         <w:t>TINYINT(</w:t>
       </w:r>
       <w:proofErr w:type="gramEnd"/>
       <w:r>
+        <w:rPr>
+          <w:highlight w:val="yellow"/>
+        </w:rPr>
         <w:t>1) DEFAULT 1,</w:t>
       </w:r>
     </w:p>
     <w:p>
-      <w:r>
-        <w:t xml:space="preserve">    </w:t>
-      </w:r>
-      <w:proofErr w:type="spellStart"/>
-      <w:r>
+      <w:pPr>
+        <w:rPr>
+          <w:highlight w:val="yellow"/>
+        </w:rPr>
+      </w:pPr>
+      <w:r>
+        <w:rPr>
+          <w:highlight w:val="yellow"/>
+        </w:rPr>
+        <w:t xml:space="preserve">    </w:t>
+      </w:r>
+      <w:proofErr w:type="spellStart"/>
+      <w:r>
+        <w:rPr>
+          <w:highlight w:val="yellow"/>
+        </w:rPr>
         <w:t>created_at</w:t>
       </w:r>
       <w:proofErr w:type="spellEnd"/>
       <w:r>
+        <w:rPr>
+          <w:highlight w:val="yellow"/>
+        </w:rPr>
         <w:t xml:space="preserve"> DATETIME DEFAULT CURRENT_TIMESTAMP,</w:t>
       </w:r>
     </w:p>
     <w:p>
-      <w:r>
-        <w:t xml:space="preserve">    </w:t>
-      </w:r>
-    </w:p>
-    <w:p>
-      <w:r>
+      <w:pPr>
+        <w:rPr>
+          <w:highlight w:val="yellow"/>
+        </w:rPr>
+      </w:pPr>
+      <w:r>
+        <w:rPr>
+          <w:highlight w:val="yellow"/>
+        </w:rPr>
+        <w:t xml:space="preserve">    </w:t>
+      </w:r>
+    </w:p>
+    <w:p>
+      <w:pPr>
+        <w:rPr>
+          <w:highlight w:val="yellow"/>
+        </w:rPr>
+      </w:pPr>
+      <w:r>
+        <w:rPr>
+          <w:highlight w:val="yellow"/>
+        </w:rPr>
         <w:t xml:space="preserve">    CONSTRAINT </w:t>
       </w:r>
       <w:proofErr w:type="spellStart"/>
       <w:r>
+        <w:rPr>
+          <w:highlight w:val="yellow"/>
+        </w:rPr>
         <w:t>fk_meter_building</w:t>
       </w:r>
       <w:proofErr w:type="spellEnd"/>
     </w:p>
     <w:p>
-      <w:r>
+      <w:pPr>
+        <w:rPr>
+          <w:highlight w:val="yellow"/>
+        </w:rPr>
+      </w:pPr>
+      <w:r>
+        <w:rPr>
+          <w:highlight w:val="yellow"/>
+        </w:rPr>
         <w:t xml:space="preserve">        FOREIGN KEY (</w:t>
       </w:r>
       <w:proofErr w:type="spellStart"/>
       <w:r>
+        <w:rPr>
+          <w:highlight w:val="yellow"/>
+        </w:rPr>
         <w:t>building_id</w:t>
       </w:r>
       <w:proofErr w:type="spellEnd"/>
       <w:r>
+        <w:rPr>
+          <w:highlight w:val="yellow"/>
+        </w:rPr>
         <w:t>) REFERENCES buildings(id)</w:t>
       </w:r>
     </w:p>
     <w:p>
-      <w:r>
+      <w:pPr>
+        <w:rPr>
+          <w:highlight w:val="yellow"/>
+        </w:rPr>
+      </w:pPr>
+      <w:r>
+        <w:rPr>
+          <w:highlight w:val="yellow"/>
+        </w:rPr>
         <w:lastRenderedPageBreak/>
         <w:t xml:space="preserve">        ON DELETE CASCADE</w:t>
       </w:r>
     </w:p>
     <w:p>
-      <w:r>
+      <w:pPr>
+        <w:rPr>
+          <w:highlight w:val="yellow"/>
+        </w:rPr>
+      </w:pPr>
+      <w:r>
+        <w:rPr>
+          <w:highlight w:val="yellow"/>
+        </w:rPr>
         <w:t>) ENGINE=</w:t>
       </w:r>
       <w:proofErr w:type="spellStart"/>
       <w:r>
+        <w:rPr>
+          <w:highlight w:val="yellow"/>
+        </w:rPr>
         <w:t>InnoDB</w:t>
       </w:r>
       <w:proofErr w:type="spellEnd"/>
       <w:r>
+        <w:rPr>
+          <w:highlight w:val="yellow"/>
+        </w:rPr>
         <w:t>;</w:t>
       </w:r>
     </w:p>
-    <w:p/>
-    <w:p>
-      <w:r>
+    <w:p>
+      <w:pPr>
+        <w:rPr>
+          <w:highlight w:val="yellow"/>
+        </w:rPr>
+      </w:pPr>
+    </w:p>
+    <w:p>
+      <w:pPr>
+        <w:rPr>
+          <w:highlight w:val="yellow"/>
+        </w:rPr>
+      </w:pPr>
+      <w:r>
+        <w:rPr>
+          <w:highlight w:val="yellow"/>
+        </w:rPr>
         <w:t>-- =====================================================</w:t>
       </w:r>
     </w:p>
     <w:p>
-      <w:r>
+      <w:pPr>
+        <w:rPr>
+          <w:highlight w:val="yellow"/>
+        </w:rPr>
+      </w:pPr>
+      <w:r>
+        <w:rPr>
+          <w:highlight w:val="yellow"/>
+        </w:rPr>
         <w:t>-- 7️</w:t>
       </w:r>
       <w:r>
         <w:rPr>
           <w:rFonts w:ascii="Segoe UI Symbol" w:hAnsi="Segoe UI Symbol" w:cs="Segoe UI Symbol"/>
+          <w:highlight w:val="yellow"/>
         </w:rPr>
         <w:t>⃣</w:t>
       </w:r>
       <w:r>
+        <w:rPr>
+          <w:highlight w:val="yellow"/>
+        </w:rPr>
         <w:t xml:space="preserve"> METER READINGS (Only stores reading data)</w:t>
       </w:r>
     </w:p>
     <w:p>
-      <w:r>
+      <w:pPr>
+        <w:rPr>
+          <w:highlight w:val="yellow"/>
+        </w:rPr>
+      </w:pPr>
+      <w:r>
+        <w:rPr>
+          <w:highlight w:val="yellow"/>
+        </w:rPr>
         <w:t>-- =====================================================</w:t>
       </w:r>
     </w:p>
-    <w:p/>
-    <w:p>
-      <w:r>
+    <w:p>
+      <w:pPr>
+        <w:rPr>
+          <w:highlight w:val="yellow"/>
+        </w:rPr>
+      </w:pPr>
+    </w:p>
+    <w:p>
+      <w:pPr>
+        <w:rPr>
+          <w:highlight w:val="yellow"/>
+        </w:rPr>
+      </w:pPr>
+      <w:r>
+        <w:rPr>
+          <w:highlight w:val="yellow"/>
+        </w:rPr>
         <w:t xml:space="preserve">CREATE TABLE </w:t>
       </w:r>
       <w:proofErr w:type="spellStart"/>
       <w:r>
+        <w:rPr>
+          <w:highlight w:val="yellow"/>
+        </w:rPr>
         <w:t>meter_readings</w:t>
       </w:r>
       <w:proofErr w:type="spellEnd"/>
       <w:r>
+        <w:rPr>
+          <w:highlight w:val="yellow"/>
+        </w:rPr>
         <w:t xml:space="preserve"> (</w:t>
       </w:r>
     </w:p>
     <w:p>
-      <w:r>
+      <w:pPr>
+        <w:rPr>
+          <w:highlight w:val="yellow"/>
+        </w:rPr>
+      </w:pPr>
+      <w:r>
+        <w:rPr>
+          <w:highlight w:val="yellow"/>
+        </w:rPr>
         <w:t xml:space="preserve">    id INT AUTO_INCREMENT PRIMARY KEY,    </w:t>
       </w:r>
     </w:p>
     <w:p>
-      <w:r>
-        <w:t xml:space="preserve">    </w:t>
-      </w:r>
-      <w:proofErr w:type="spellStart"/>
-      <w:r>
+      <w:pPr>
+        <w:rPr>
+          <w:highlight w:val="yellow"/>
+        </w:rPr>
+      </w:pPr>
+      <w:r>
+        <w:rPr>
+          <w:highlight w:val="yellow"/>
+        </w:rPr>
+        <w:t xml:space="preserve">    </w:t>
+      </w:r>
+      <w:proofErr w:type="spellStart"/>
+      <w:r>
+        <w:rPr>
+          <w:highlight w:val="yellow"/>
+        </w:rPr>
         <w:t>meter_id</w:t>
       </w:r>
       <w:proofErr w:type="spellEnd"/>
       <w:r>
+        <w:rPr>
+          <w:highlight w:val="yellow"/>
+        </w:rPr>
         <w:t xml:space="preserve"> INT NOT NULL,    </w:t>
       </w:r>
     </w:p>
     <w:p>
-      <w:r>
-        <w:t xml:space="preserve">    </w:t>
-      </w:r>
-      <w:proofErr w:type="spellStart"/>
-      <w:r>
+      <w:pPr>
+        <w:rPr>
+          <w:highlight w:val="yellow"/>
+        </w:rPr>
+      </w:pPr>
+      <w:r>
+        <w:rPr>
+          <w:highlight w:val="yellow"/>
+        </w:rPr>
+        <w:t xml:space="preserve">    </w:t>
+      </w:r>
+      <w:proofErr w:type="spellStart"/>
+      <w:r>
+        <w:rPr>
+          <w:highlight w:val="yellow"/>
+        </w:rPr>
         <w:t>reading_date</w:t>
       </w:r>
       <w:proofErr w:type="spellEnd"/>
       <w:r>
+        <w:rPr>
+          <w:highlight w:val="yellow"/>
+        </w:rPr>
         <w:t xml:space="preserve"> DATE NOT NULL,    </w:t>
       </w:r>
     </w:p>
     <w:p>
-      <w:r>
-        <w:t xml:space="preserve">    </w:t>
-      </w:r>
-      <w:proofErr w:type="spellStart"/>
-      <w:r>
+      <w:pPr>
+        <w:rPr>
+          <w:highlight w:val="yellow"/>
+        </w:rPr>
+      </w:pPr>
+      <w:r>
+        <w:rPr>
+          <w:highlight w:val="yellow"/>
+        </w:rPr>
+        <w:t xml:space="preserve">    </w:t>
+      </w:r>
+      <w:proofErr w:type="spellStart"/>
+      <w:r>
+        <w:rPr>
+          <w:highlight w:val="yellow"/>
+        </w:rPr>
         <w:t>previous_reading</w:t>
       </w:r>
       <w:proofErr w:type="spellEnd"/>
       <w:r>
+        <w:rPr>
+          <w:highlight w:val="yellow"/>
+        </w:rPr>
         <w:t xml:space="preserve"> INT UNSIGNED NOT NULL,</w:t>
       </w:r>
     </w:p>
     <w:p>
-      <w:r>
-        <w:t xml:space="preserve">    </w:t>
-      </w:r>
-      <w:proofErr w:type="spellStart"/>
-      <w:r>
+      <w:pPr>
+        <w:rPr>
+          <w:highlight w:val="yellow"/>
+        </w:rPr>
+      </w:pPr>
+      <w:r>
+        <w:rPr>
+          <w:highlight w:val="yellow"/>
+        </w:rPr>
+        <w:t xml:space="preserve">    </w:t>
+      </w:r>
+      <w:proofErr w:type="spellStart"/>
+      <w:r>
+        <w:rPr>
+          <w:highlight w:val="yellow"/>
+        </w:rPr>
         <w:t>current_reading</w:t>
       </w:r>
       <w:proofErr w:type="spellEnd"/>
       <w:r>
+        <w:rPr>
+          <w:highlight w:val="yellow"/>
+        </w:rPr>
         <w:t xml:space="preserve"> INT UNSIGNED NOT NULL,    </w:t>
       </w:r>
     </w:p>
     <w:p>
-      <w:r>
-        <w:t xml:space="preserve">    </w:t>
-      </w:r>
-      <w:proofErr w:type="spellStart"/>
-      <w:r>
+      <w:pPr>
+        <w:rPr>
+          <w:highlight w:val="yellow"/>
+        </w:rPr>
+      </w:pPr>
+      <w:r>
+        <w:rPr>
+          <w:highlight w:val="yellow"/>
+        </w:rPr>
+        <w:t xml:space="preserve">    </w:t>
+      </w:r>
+      <w:proofErr w:type="spellStart"/>
+      <w:r>
+        <w:rPr>
+          <w:highlight w:val="yellow"/>
+        </w:rPr>
         <w:t>per_unit_rate</w:t>
       </w:r>
       <w:proofErr w:type="spellEnd"/>
       <w:r>
+        <w:rPr>
+          <w:highlight w:val="yellow"/>
+        </w:rPr>
         <w:t xml:space="preserve"> </w:t>
       </w:r>
       <w:proofErr w:type="gramStart"/>
       <w:r>
+        <w:rPr>
+          <w:highlight w:val="yellow"/>
+        </w:rPr>
         <w:t>DECIMAL(</w:t>
       </w:r>
       <w:proofErr w:type="gramEnd"/>
       <w:r>
+        <w:rPr>
+          <w:highlight w:val="yellow"/>
+        </w:rPr>
         <w:t xml:space="preserve">10,2) NOT NULL DEFAULT 8.50,    </w:t>
       </w:r>
     </w:p>
     <w:p>
-      <w:r>
-        <w:t xml:space="preserve">    </w:t>
-      </w:r>
-      <w:proofErr w:type="spellStart"/>
-      <w:r>
+      <w:pPr>
+        <w:rPr>
+          <w:highlight w:val="yellow"/>
+        </w:rPr>
+      </w:pPr>
+      <w:r>
+        <w:rPr>
+          <w:highlight w:val="yellow"/>
+        </w:rPr>
+        <w:t xml:space="preserve">    </w:t>
+      </w:r>
+      <w:proofErr w:type="spellStart"/>
+      <w:r>
+        <w:rPr>
+          <w:highlight w:val="yellow"/>
+        </w:rPr>
         <w:t>image_path</w:t>
       </w:r>
       <w:proofErr w:type="spellEnd"/>
       <w:r>
+        <w:rPr>
+          <w:highlight w:val="yellow"/>
+        </w:rPr>
         <w:t xml:space="preserve"> </w:t>
       </w:r>
       <w:proofErr w:type="gramStart"/>
       <w:r>
+        <w:rPr>
+          <w:highlight w:val="yellow"/>
+        </w:rPr>
         <w:t>VARCHAR(</w:t>
       </w:r>
       <w:proofErr w:type="gramEnd"/>
       <w:r>
+        <w:rPr>
+          <w:highlight w:val="yellow"/>
+        </w:rPr>
         <w:t xml:space="preserve">255) NULL,    </w:t>
       </w:r>
     </w:p>
     <w:p>
-      <w:r>
-        <w:t xml:space="preserve">    </w:t>
-      </w:r>
-      <w:proofErr w:type="spellStart"/>
-      <w:r>
+      <w:pPr>
+        <w:rPr>
+          <w:highlight w:val="yellow"/>
+        </w:rPr>
+      </w:pPr>
+      <w:r>
+        <w:rPr>
+          <w:highlight w:val="yellow"/>
+        </w:rPr>
+        <w:t xml:space="preserve">    </w:t>
+      </w:r>
+      <w:proofErr w:type="spellStart"/>
+      <w:r>
+        <w:rPr>
+          <w:highlight w:val="yellow"/>
+        </w:rPr>
         <w:t>created_at</w:t>
       </w:r>
       <w:proofErr w:type="spellEnd"/>
       <w:r>
+        <w:rPr>
+          <w:highlight w:val="yellow"/>
+        </w:rPr>
         <w:t xml:space="preserve"> TIMESTAMP DEFAULT CURRENT_TIMESTAMP,    </w:t>
       </w:r>
     </w:p>
     <w:p>
-      <w:r>
+      <w:pPr>
+        <w:rPr>
+          <w:highlight w:val="yellow"/>
+        </w:rPr>
+      </w:pPr>
+      <w:r>
+        <w:rPr>
+          <w:highlight w:val="yellow"/>
+        </w:rPr>
         <w:t xml:space="preserve">    CONSTRAINT </w:t>
       </w:r>
       <w:proofErr w:type="spellStart"/>
       <w:r>
+        <w:rPr>
+          <w:highlight w:val="yellow"/>
+        </w:rPr>
         <w:t>fk_reading_meter</w:t>
       </w:r>
       <w:proofErr w:type="spellEnd"/>
     </w:p>
     <w:p>
-      <w:r>
+      <w:pPr>
+        <w:rPr>
+          <w:highlight w:val="yellow"/>
+        </w:rPr>
+      </w:pPr>
+      <w:r>
+        <w:rPr>
+          <w:highlight w:val="yellow"/>
+        </w:rPr>
         <w:t xml:space="preserve">        FOREIGN KEY (</w:t>
       </w:r>
       <w:proofErr w:type="spellStart"/>
       <w:r>
+        <w:rPr>
+          <w:highlight w:val="yellow"/>
+        </w:rPr>
         <w:t>meter_id</w:t>
       </w:r>
       <w:proofErr w:type="spellEnd"/>
       <w:r>
+        <w:rPr>
+          <w:highlight w:val="yellow"/>
+        </w:rPr>
         <w:t>) REFERENCES meters(id)</w:t>
       </w:r>
     </w:p>
     <w:p>
-      <w:r>
+      <w:pPr>
+        <w:rPr>
+          <w:highlight w:val="yellow"/>
+        </w:rPr>
+      </w:pPr>
+      <w:r>
+        <w:rPr>
+          <w:highlight w:val="yellow"/>
+        </w:rPr>
         <w:t xml:space="preserve">        ON DELETE CASCADE,        </w:t>
       </w:r>
     </w:p>
     <w:p>
-      <w:r>
+      <w:pPr>
+        <w:rPr>
+          <w:highlight w:val="yellow"/>
+        </w:rPr>
+      </w:pPr>
+      <w:r>
+        <w:rPr>
+          <w:highlight w:val="yellow"/>
+        </w:rPr>
         <w:t xml:space="preserve">    UNIQUE KEY </w:t>
       </w:r>
       <w:proofErr w:type="spellStart"/>
       <w:r>
+        <w:rPr>
+          <w:highlight w:val="yellow"/>
+        </w:rPr>
         <w:t>uniq_meter_date</w:t>
       </w:r>
       <w:proofErr w:type="spellEnd"/>
       <w:r>
+        <w:rPr>
+          <w:highlight w:val="yellow"/>
+        </w:rPr>
         <w:t xml:space="preserve"> (</w:t>
       </w:r>
       <w:proofErr w:type="spellStart"/>
       <w:r>
+        <w:rPr>
+          <w:highlight w:val="yellow"/>
+        </w:rPr>
         <w:t>meter_id</w:t>
       </w:r>
       <w:proofErr w:type="spellEnd"/>
       <w:r>
+        <w:rPr>
+          <w:highlight w:val="yellow"/>
+        </w:rPr>
         <w:t xml:space="preserve">, </w:t>
       </w:r>
       <w:proofErr w:type="spellStart"/>
       <w:r>
+        <w:rPr>
+          <w:highlight w:val="yellow"/>
+        </w:rPr>
         <w:t>reading_date</w:t>
       </w:r>
       <w:proofErr w:type="spellEnd"/>
       <w:r>
+        <w:rPr>
+          <w:highlight w:val="yellow"/>
+        </w:rPr>
         <w:t xml:space="preserve">),    </w:t>
       </w:r>
     </w:p>
     <w:p>
-      <w:r>
+      <w:pPr>
+        <w:rPr>
+          <w:highlight w:val="yellow"/>
+        </w:rPr>
+      </w:pPr>
+      <w:r>
+        <w:rPr>
+          <w:highlight w:val="yellow"/>
+        </w:rPr>
         <w:t xml:space="preserve">    INDEX </w:t>
       </w:r>
       <w:proofErr w:type="spellStart"/>
       <w:r>
+        <w:rPr>
+          <w:highlight w:val="yellow"/>
+        </w:rPr>
         <w:t>idx_reading_date</w:t>
       </w:r>
       <w:proofErr w:type="spellEnd"/>
       <w:r>
+        <w:rPr>
+          <w:highlight w:val="yellow"/>
+        </w:rPr>
         <w:t xml:space="preserve"> (</w:t>
       </w:r>
       <w:proofErr w:type="spellStart"/>
       <w:r>
+        <w:rPr>
+          <w:highlight w:val="yellow"/>
+        </w:rPr>
         <w:t>reading_date</w:t>
       </w:r>
       <w:proofErr w:type="spellEnd"/>
       <w:r>
+        <w:rPr>
+          <w:highlight w:val="yellow"/>
+        </w:rPr>
         <w:t>)</w:t>
       </w:r>
     </w:p>
     <w:p>
       <w:r>
+        <w:rPr>
+          <w:highlight w:val="yellow"/>
+        </w:rPr>
         <w:t>) ENGINE=</w:t>
       </w:r>
       <w:proofErr w:type="spellStart"/>
       <w:r>
+        <w:rPr>
+          <w:highlight w:val="yellow"/>
+        </w:rPr>
         <w:t>InnoDB</w:t>
       </w:r>
       <w:proofErr w:type="spellEnd"/>
       <w:r>
+        <w:rPr>
+          <w:highlight w:val="yellow"/>
+        </w:rPr>
         <w:t>;</w:t>
       </w:r>
     </w:p>
@@ -2277,6 +3425,7 @@
   <w:style w:type="character" w:default="1" w:styleId="DefaultParagraphFont">
     <w:name w:val="Default Paragraph Font"/>
     <w:uiPriority w:val="1"/>
+    <w:semiHidden/>
     <w:unhideWhenUsed/>
   </w:style>
   <w:style w:type="table" w:default="1" w:styleId="TableNormal">

</xml_diff>